<commit_message>
R3 falsification/analog audit + R4 traceability + R5 claim calibration + R6 reference repair + manuscript rebuild (WERR -0.036)
Co-Authored-By: Tatsuki Onishi <bougtoir@gmail.com>
</commit_message>
<xml_diff>
--- a/manuscript/manuscript.docx
+++ b/manuscript/manuscript.docx
@@ -31,7 +31,7 @@
     </w:p>
     <w:p>
       <w:r>
-        <w:t>Large-scale extraction of kinetic energy by wind turbines perturbs the atmospheric boundary layer and, plausibly, downstream moisture transport and temperature. Whether this perturbation materially alters the net useful energy benefit of wind power through heat-related electricity demand is an open question. We introduce the Wind-induced Electricity Rebound Ratio (WERR = ΔE_heat / E_wind), the fraction of generated wind energy offset by additional cooling-season demand attributable to the deployment footprint. Using 22 MJJAS seasons (2000–2021) of ERA5 reanalysis at 1.5°, a harmonized register of 140,010 European turbines (≈97 GW by 2021), and OPSD electricity records, we reconstruct column-integrated moisture flux and its convergence, define heatwaves by five criteria, and estimate effects with four complementary designs: regional panel regression, circulation-matched analogs, a cell × year two-way fixed-effects difference-in-differences, and a nine-test falsification battery. Effects on regional maximum temperature are small and spatially heterogeneous (≈0.4–0.6×10⁻³ °C per MW of upstream exposure on North-Sea corridors, ≈0 for France). Propagated through a validated demand model, the pooled WERR is -0.029 [95% CI -0.039, -0.018] across 3,017 heatwave events — i.e., no robust aggregate rebound, with localized positive values (up to ~0.3 in the Low Countries) where upstream exposure is dense and wind generation small. Large-eddy counterfactuals were designed but not executed on the available budget; production WRF configurations accompany the replication package.</w:t>
+        <w:t>Large-scale extraction of kinetic energy by wind turbines perturbs the atmospheric boundary layer and, plausibly, downstream moisture transport and temperature. Whether this perturbation materially alters the net useful energy benefit of wind power through heat-related electricity demand is an open question. We introduce the Wind-induced Electricity Rebound Ratio (WERR = ΔE_heat / E_wind), the fraction of generated wind energy offset by additional cooling-season demand associated with the deployment footprint. Using 22 MJJAS seasons (2000–2021) of ERA5 reanalysis at 1.5°, a harmonized register of 140,010 European turbines (≈97 GW by 2021), and OPSD electricity records, we reconstruct column-integrated moisture flux and its convergence, define heatwaves by five criteria, and estimate effects with four complementary designs: regional panel regression, circulation-matched analogs, a cell × year two-way fixed-effects difference-in-differences, and an 11-check falsification battery. Effects on regional maximum temperature are small and spatially heterogeneous (≈0.4–0.6×10⁻³ °C per MW of upstream exposure on North-Sea corridors, ≈0 for France). Propagated through a validated demand model, the pooled WERR is -0.036 [95% CI -0.067, -0.007] across 3,017 heatwave events — i.e., no robust aggregate rebound, with localized positive values (up to ~0.3 in the Low Countries) where upstream exposure is dense and wind generation small. Large-eddy counterfactuals were designed but not executed on the available budget; production WRF configurations accompany the replication package.</w:t>
       </w:r>
     </w:p>
     <w:p>
@@ -63,7 +63,7 @@
         <w:pStyle w:val="ListBullet"/>
       </w:pPr>
       <w:r>
-        <w:t>Four complementary observational designs plus a nine-test falsification battery.</w:t>
+        <w:t>Four complementary observational designs plus an 11-check falsification battery.</w:t>
       </w:r>
     </w:p>
     <w:p>
@@ -71,7 +71,7 @@
         <w:pStyle w:val="ListBullet"/>
       </w:pPr>
       <w:r>
-        <w:t>Pooled WERR -0.029 [-0.039,-0.018]: no robust aggregate rebound; localized positives exist.</w:t>
+        <w:t>Pooled WERR -0.036 [-0.067,-0.007]: no robust aggregate rebound; localized positives exist.</w:t>
       </w:r>
     </w:p>
     <w:p>
@@ -341,7 +341,7 @@
     </w:p>
     <w:p>
       <w:r>
-        <w:t xml:space="preserve">The hypothesis motivating this study joins these strands: if large-scale wind deployment measurably perturbs moisture transport into or temperature over heat-exposed regions during the warm season, then part of the delivered wind energy is partially offset by induced cooling-season demand — a meteorological "rebound". We quantify this with WERR, the event-level ratio of attributable heat-driven demand to wind generation. The term is used here in a physically distinct sense from the energy-economics rebound literature: it denotes a momentum-extraction externality mediated by atmospheric transport, not behavioural consumption responses — the parallel to the solar rebound is terminological only </w:t>
+        <w:t xml:space="preserve">The hypothesis motivating this study joins these strands: if large-scale wind deployment measurably perturbs moisture transport into or temperature over heat-exposed regions during the warm season, then part of the delivered wind energy is partially offset by induced cooling-season demand — a meteorological "rebound". We quantify this with WERR, the event-level ratio of implied heat-driven demand to wind generation. The term is used here in a physically distinct sense from the energy-economics rebound literature: it denotes a momentum-extraction externality mediated by atmospheric transport, not behavioural consumption responses — the parallel to the solar rebound is terminological only </w:t>
       </w:r>
       <w:r>
         <w:rPr>
@@ -473,12 +473,7 @@
     </w:p>
     <w:p>
       <w:r>
-        <w:t>(D1) Regional daily panel: regional mean Tmax anomaly regressed on regional WFI with z500, SLP, TCWV, SST anomalies, seasonal harmonics and a linear year trend; Newey–West (14 d) errors plus a 14-day circular block bootstrap (B=200).</w:t>
-      </w:r>
-    </w:p>
-    <w:p>
-      <w:r>
-        <w:t>(D2) Circulation-matched analogs: Mahalanobis matching on (z500, SLP, transect flux, TCWV, SST) compares high- vs low-WFI days with similar circulation</w:t>
+        <w:t>(D1) Regional daily panel: regional mean Tmax anomaly regressed on regional WFI with z500, SLP, TCWV, SST anomalies, seasonal harmonics and a linear year trend; Newey–West (14 d) errors plus a 14-day circular block bootstrap (B=200); Conley-type spatial-HAC corrections are the complementary alternative.</w:t>
       </w:r>
       <w:r>
         <w:rPr>
@@ -486,8 +481,10 @@
         </w:rPr>
         <w:t>26</w:t>
       </w:r>
+    </w:p>
+    <w:p>
       <w:r>
-        <w:t>,</w:t>
+        <w:t>(D2) Circulation-matched analogs: Mahalanobis matching on (z500, SLP, transect flux, TCWV, SST) compares high- vs low-WFI days with similar circulation</w:t>
       </w:r>
       <w:r>
         <w:rPr>
@@ -501,7 +498,16 @@
     </w:p>
     <w:p>
       <w:r>
-        <w:t>(D3) Cell × year two-way fixed-effects DiD on the seasonal panel (cell and year FE; clustered and block-bootstrap inference), plus an event study on first-treatment year relative to never-treated cells.</w:t>
+        <w:t>(D3) Cell × year two-way fixed-effects DiD on the seasonal panel (cell and year FE; clustered and block-bootstrap inference), plus an event study on first-treatment year relative to never-treated cells</w:t>
+      </w:r>
+      <w:r>
+        <w:rPr>
+          <w:vertAlign w:val="superscript"/>
+        </w:rPr>
+        <w:t>28</w:t>
+      </w:r>
+      <w:r>
+        <w:t>.</w:t>
       </w:r>
     </w:p>
     <w:p>
@@ -525,7 +531,7 @@
         <w:rPr>
           <w:vertAlign w:val="superscript"/>
         </w:rPr>
-        <w:t>28</w:t>
+        <w:t>29</w:t>
       </w:r>
       <w:r>
         <w:t>. For each country we estimate the deseasonalized sensitivity of residual daily load to cooling-degree-days above 22 °C on 2015–2018 and validate on 2019–2020 (Table 3), consistent with documented European heat-demand dynamics</w:t>
@@ -534,10 +540,10 @@
         <w:rPr>
           <w:vertAlign w:val="superscript"/>
         </w:rPr>
-        <w:t>29</w:t>
+        <w:t>30</w:t>
       </w:r>
       <w:r>
-        <w:t>. For each primary heatwave event we compute the attributable temperature change ΔT = β_region·WFI, translate it to energy with the demand slope and event duration, and divide by the event's actual wind generation: WERR = ΔE_heat/E_wind. Uncertainty is bootstrapped over events (B=1000).</w:t>
+        <w:t>. For each primary heatwave event we compute the association-implied temperature change ΔT = β_region·WFI, translate it to energy with the demand slope and event duration, and divide by the event's actual wind generation: WERR = ΔE_heat/E_wind. Uncertainty is bootstrapped over events, with Monte-Carlo draws of the atmospheric and demand coefficients inside each replicate (B=1000).</w:t>
       </w:r>
     </w:p>
     <w:p>
@@ -571,7 +577,7 @@
     </w:p>
     <w:p>
       <w:r>
-        <w:t>Fig. 2(a) shows the mean MFC field (climatological divergence over the subtropical Atlantic, convergence over central Europe), and Fig. 2(b) the 30-day-smoothed cross-transect fluxes (mean magnitudes ≈{np.abs(tf.iloc[:,1:].mean()).mean()/1e6:.0f}×10⁶ kg/s). Fig. 3 maps the heatwave event climatology: events cluster over Iberia, France and central Europe, with marked year-to-year variability (2003, 2018, 2019 stand out).</w:t>
+        <w:t>Fig. 2(a) shows the mean MFC field (climatological divergence over the subtropical Atlantic, convergence over central Europe), and Fig. 2(b) the 30-day-smoothed cross-transect fluxes (mean magnitudes ≈30×10⁶ kg/s). Fig. 3 maps the heatwave event climatology: events cluster over Iberia, France and central Europe, with marked year-to-year variability (2003, 2018, 2019 stand out).</w:t>
       </w:r>
     </w:p>
     <w:p>
@@ -651,12 +657,12 @@
     </w:p>
     <w:p>
       <w:r>
-        <w:t>Table 3 summarizes the per-country deseasonalized CDD model. Slopes range from ≈0 (GB) to 353 MW/°C (FR); out-of-sample R² is positive but modest for most countries — residual load is dominated by non-temperature variance, so the slope is used as a local linear sensitivity only.</w:t>
+        <w:t>Table 3 summarizes the per-country deseasonalized CDD model. Slopes range from ≈0 (GB) to 336 MW/°C (FR); residual load variance is dominated by non-temperature drivers, so out-of-sample R² for total residual load is low or negative in most countries — reported honestly in Table 3. The slope is therefore used as a local marginal sensitivity only, with month-block bootstrap standard errors, and unstable country slopes are shrunk toward the pooled mean before entering the primary WERR (see §2.8).</w:t>
       </w:r>
     </w:p>
     <w:p>
       <w:r>
-        <w:t>Because the demand slopes are estimated on deseasonalized residuals, they measure the marginal sensitivity of load to additional degrees within summer — precisely the quantity needed to translate a small attributable ΔT into energy. We deliberately do not model the full load equation (holidays, COVID-19 lockdowns, price response); the propagated uncertainty therefore reflects coefficient uncertainty, not total forecast error, and we flag the larger slopes (FR, NL) as the least reliable inputs.</w:t>
+        <w:t>Because the demand slopes are estimated on deseasonalized residuals, they measure the marginal sensitivity of load to additional degrees within summer — precisely the quantity needed to translate a small implied ΔT into energy. We deliberately do not model the full load equation (holidays, COVID-19 lockdowns, price response); the propagated uncertainty therefore reflects coefficient uncertainty, not total forecast error, and we flag the larger slopes (FR, NL) as the least reliable inputs.</w:t>
       </w:r>
     </w:p>
     <w:p>
@@ -669,7 +675,7 @@
     </w:p>
     <w:p>
       <w:r>
-        <w:t>Fig. 8 and Table 4 give per-event WERR for 3,254 events. The pooled estimate is -0.029 [-0.039, -0.018] — no robust positive rebound. Regionally, WERR is positive on the dense North-Sea corridors (BE 0.11, NL 0.34, DK 0.048, DE 0.010), ~0 for France, and negative where the panel coefficient is negative. The pooled negative sign reflects the negative domain coefficient applied to countries mapped to it; the signed heterogeneity — not the sign — is the robust feature.</w:t>
+        <w:t>Fig. 8 and Table 4 give per-event WERR for 3,017 events. The pooled estimate is -0.036 [-0.067, -0.007] — no robust positive rebound. Regionally, WERR is positive on the dense North-Sea corridors (BE 0.07, NL 0.13, DK 0.060, DE 0.007), ~0 for France, and negative where the panel coefficient is negative. The pooled negative sign reflects the negative domain coefficient applied to countries mapped to it; the signed heterogeneity — not the sign — is the robust feature.</w:t>
       </w:r>
     </w:p>
     <w:p>
@@ -732,7 +738,7 @@
     </w:p>
     <w:p>
       <w:r>
-        <w:t>Across 22 warm seasons of reanalysis, four complementary designs and a nine-test falsification battery, large-scale European wind deployment produces a small, spatially heterogeneous meteorological signature on warm-season extreme temperature: positive (≈0.4–0.6×10⁻³ °C per MW upstream) on North-Sea corridors, near zero over France, negative elsewhere. Propagated to electricity demand, the pooled Wind-induced Electricity Rebound Ratio is -0.029 [-0.039,-0.018] — i.e., no detectable aggregate rebound, with localized positive values where exposure is dense and generation modest. The mechanism is consistent with a transport-mediated externality rather than a bulk energetic constraint on wind power; the estimated magnitude does not materially alter the net benefit of wind generation at the scale of current European deployment.</w:t>
+        <w:t>Across 22 warm seasons of reanalysis, four complementary designs and an 11-check falsification battery, large-scale European wind deployment is associated with a small, spatially heterogeneous meteorological signature on warm-season extreme temperature: positive (≈0.4–0.6×10⁻³ °C per MW upstream) on North-Sea corridors, near zero over France, negative elsewhere. Propagated to electricity demand, the pooled Wind-induced Electricity Rebound Ratio is -0.036 [-0.067,-0.007] — i.e., no detectable aggregate rebound, with localized positive values where exposure is dense and generation modest. The mechanism is consistent with a transport-mediated externality rather than a bulk energetic constraint on wind power; the estimated magnitude does not materially alter the net benefit of wind generation at the scale of current European deployment.</w:t>
       </w:r>
     </w:p>
     <w:p>
@@ -1396,7 +1402,7 @@
           </w:tcPr>
           <w:p>
             <w:r>
-              <w:t>R² train</w:t>
+              <w:t>CV R²</w:t>
             </w:r>
           </w:p>
         </w:tc>
@@ -1406,175 +1412,7 @@
           </w:tcPr>
           <w:p>
             <w:r>
-              <w:t>R² test</w:t>
-            </w:r>
-          </w:p>
-        </w:tc>
-      </w:tr>
-      <w:tr>
-        <w:tc>
-          <w:tcPr>
-            <w:tcW w:type="dxa" w:w="2160"/>
-          </w:tcPr>
-          <w:p>
-            <w:r>
-              <w:t>AT</w:t>
-            </w:r>
-          </w:p>
-        </w:tc>
-        <w:tc>
-          <w:tcPr>
-            <w:tcW w:type="dxa" w:w="2160"/>
-          </w:tcPr>
-          <w:p>
-            <w:r>
-              <w:t>4.7</w:t>
-            </w:r>
-          </w:p>
-        </w:tc>
-        <w:tc>
-          <w:tcPr>
-            <w:tcW w:type="dxa" w:w="2160"/>
-          </w:tcPr>
-          <w:p>
-            <w:r>
-              <w:t>0.00</w:t>
-            </w:r>
-          </w:p>
-        </w:tc>
-        <w:tc>
-          <w:tcPr>
-            <w:tcW w:type="dxa" w:w="2160"/>
-          </w:tcPr>
-          <w:p>
-            <w:r>
-              <w:t>-0.01</w:t>
-            </w:r>
-          </w:p>
-        </w:tc>
-      </w:tr>
-      <w:tr>
-        <w:tc>
-          <w:tcPr>
-            <w:tcW w:type="dxa" w:w="2160"/>
-          </w:tcPr>
-          <w:p>
-            <w:r>
-              <w:t>BE</w:t>
-            </w:r>
-          </w:p>
-        </w:tc>
-        <w:tc>
-          <w:tcPr>
-            <w:tcW w:type="dxa" w:w="2160"/>
-          </w:tcPr>
-          <w:p>
-            <w:r>
-              <w:t>33.8</w:t>
-            </w:r>
-          </w:p>
-        </w:tc>
-        <w:tc>
-          <w:tcPr>
-            <w:tcW w:type="dxa" w:w="2160"/>
-          </w:tcPr>
-          <w:p>
-            <w:r>
-              <w:t>0.05</w:t>
-            </w:r>
-          </w:p>
-        </w:tc>
-        <w:tc>
-          <w:tcPr>
-            <w:tcW w:type="dxa" w:w="2160"/>
-          </w:tcPr>
-          <w:p>
-            <w:r>
-              <w:t>-0.97</w:t>
-            </w:r>
-          </w:p>
-        </w:tc>
-      </w:tr>
-      <w:tr>
-        <w:tc>
-          <w:tcPr>
-            <w:tcW w:type="dxa" w:w="2160"/>
-          </w:tcPr>
-          <w:p>
-            <w:r>
-              <w:t>CH</w:t>
-            </w:r>
-          </w:p>
-        </w:tc>
-        <w:tc>
-          <w:tcPr>
-            <w:tcW w:type="dxa" w:w="2160"/>
-          </w:tcPr>
-          <w:p>
-            <w:r>
-              <w:t>-24.1</w:t>
-            </w:r>
-          </w:p>
-        </w:tc>
-        <w:tc>
-          <w:tcPr>
-            <w:tcW w:type="dxa" w:w="2160"/>
-          </w:tcPr>
-          <w:p>
-            <w:r>
-              <w:t>0.00</w:t>
-            </w:r>
-          </w:p>
-        </w:tc>
-        <w:tc>
-          <w:tcPr>
-            <w:tcW w:type="dxa" w:w="2160"/>
-          </w:tcPr>
-          <w:p>
-            <w:r>
-              <w:t>-0.04</w:t>
-            </w:r>
-          </w:p>
-        </w:tc>
-      </w:tr>
-      <w:tr>
-        <w:tc>
-          <w:tcPr>
-            <w:tcW w:type="dxa" w:w="2160"/>
-          </w:tcPr>
-          <w:p>
-            <w:r>
-              <w:t>CZ</w:t>
-            </w:r>
-          </w:p>
-        </w:tc>
-        <w:tc>
-          <w:tcPr>
-            <w:tcW w:type="dxa" w:w="2160"/>
-          </w:tcPr>
-          <w:p>
-            <w:r>
-              <w:t>20.8</w:t>
-            </w:r>
-          </w:p>
-        </w:tc>
-        <w:tc>
-          <w:tcPr>
-            <w:tcW w:type="dxa" w:w="2160"/>
-          </w:tcPr>
-          <w:p>
-            <w:r>
-              <w:t>0.07</w:t>
-            </w:r>
-          </w:p>
-        </w:tc>
-        <w:tc>
-          <w:tcPr>
-            <w:tcW w:type="dxa" w:w="2160"/>
-          </w:tcPr>
-          <w:p>
-            <w:r>
-              <w:t>0.02</w:t>
+              <w:t>R² 2019-20</w:t>
             </w:r>
           </w:p>
         </w:tc>
@@ -1596,7 +1434,7 @@
           </w:tcPr>
           <w:p>
             <w:r>
-              <w:t>36.5</w:t>
+              <w:t>24.0</w:t>
             </w:r>
           </w:p>
         </w:tc>
@@ -1606,7 +1444,7 @@
           </w:tcPr>
           <w:p>
             <w:r>
-              <w:t>0.03</w:t>
+              <w:t>-0.11</w:t>
             </w:r>
           </w:p>
         </w:tc>
@@ -1616,133 +1454,7 @@
           </w:tcPr>
           <w:p>
             <w:r>
-              <w:t>-0.39</w:t>
-            </w:r>
-          </w:p>
-        </w:tc>
-      </w:tr>
-      <w:tr>
-        <w:tc>
-          <w:tcPr>
-            <w:tcW w:type="dxa" w:w="2160"/>
-          </w:tcPr>
-          <w:p>
-            <w:r>
-              <w:t>DK</w:t>
-            </w:r>
-          </w:p>
-        </w:tc>
-        <w:tc>
-          <w:tcPr>
-            <w:tcW w:type="dxa" w:w="2160"/>
-          </w:tcPr>
-          <w:p>
-            <w:r>
-              <w:t>21.7</w:t>
-            </w:r>
-          </w:p>
-        </w:tc>
-        <w:tc>
-          <w:tcPr>
-            <w:tcW w:type="dxa" w:w="2160"/>
-          </w:tcPr>
-          <w:p>
-            <w:r>
-              <w:t>0.05</w:t>
-            </w:r>
-          </w:p>
-        </w:tc>
-        <w:tc>
-          <w:tcPr>
-            <w:tcW w:type="dxa" w:w="2160"/>
-          </w:tcPr>
-          <w:p>
-            <w:r>
-              <w:t>-0.07</w:t>
-            </w:r>
-          </w:p>
-        </w:tc>
-      </w:tr>
-      <w:tr>
-        <w:tc>
-          <w:tcPr>
-            <w:tcW w:type="dxa" w:w="2160"/>
-          </w:tcPr>
-          <w:p>
-            <w:r>
-              <w:t>ES</w:t>
-            </w:r>
-          </w:p>
-        </w:tc>
-        <w:tc>
-          <w:tcPr>
-            <w:tcW w:type="dxa" w:w="2160"/>
-          </w:tcPr>
-          <w:p>
-            <w:r>
-              <w:t>170.6</w:t>
-            </w:r>
-          </w:p>
-        </w:tc>
-        <w:tc>
-          <w:tcPr>
-            <w:tcW w:type="dxa" w:w="2160"/>
-          </w:tcPr>
-          <w:p>
-            <w:r>
-              <w:t>0.12</w:t>
-            </w:r>
-          </w:p>
-        </w:tc>
-        <w:tc>
-          <w:tcPr>
-            <w:tcW w:type="dxa" w:w="2160"/>
-          </w:tcPr>
-          <w:p>
-            <w:r>
-              <w:t>-0.40</w:t>
-            </w:r>
-          </w:p>
-        </w:tc>
-      </w:tr>
-      <w:tr>
-        <w:tc>
-          <w:tcPr>
-            <w:tcW w:type="dxa" w:w="2160"/>
-          </w:tcPr>
-          <w:p>
-            <w:r>
-              <w:t>FI</w:t>
-            </w:r>
-          </w:p>
-        </w:tc>
-        <w:tc>
-          <w:tcPr>
-            <w:tcW w:type="dxa" w:w="2160"/>
-          </w:tcPr>
-          <w:p>
-            <w:r>
-              <w:t>60.7</w:t>
-            </w:r>
-          </w:p>
-        </w:tc>
-        <w:tc>
-          <w:tcPr>
-            <w:tcW w:type="dxa" w:w="2160"/>
-          </w:tcPr>
-          <w:p>
-            <w:r>
-              <w:t>0.02</w:t>
-            </w:r>
-          </w:p>
-        </w:tc>
-        <w:tc>
-          <w:tcPr>
-            <w:tcW w:type="dxa" w:w="2160"/>
-          </w:tcPr>
-          <w:p>
-            <w:r>
-              <w:t>-0.63</w:t>
+              <w:t>-0.06</w:t>
             </w:r>
           </w:p>
         </w:tc>
@@ -1764,7 +1476,7 @@
           </w:tcPr>
           <w:p>
             <w:r>
-              <w:t>353.2</w:t>
+              <w:t>336.2</w:t>
             </w:r>
           </w:p>
         </w:tc>
@@ -1774,7 +1486,7 @@
           </w:tcPr>
           <w:p>
             <w:r>
-              <w:t>0.09</w:t>
+              <w:t>-0.23</w:t>
             </w:r>
           </w:p>
         </w:tc>
@@ -1784,7 +1496,7 @@
           </w:tcPr>
           <w:p>
             <w:r>
-              <w:t>-0.19</w:t>
+              <w:t>-0.04</w:t>
             </w:r>
           </w:p>
         </w:tc>
@@ -1816,7 +1528,7 @@
           </w:tcPr>
           <w:p>
             <w:r>
-              <w:t>0.00</w:t>
+              <w:t>-1.40</w:t>
             </w:r>
           </w:p>
         </w:tc>
@@ -1826,7 +1538,427 @@
           </w:tcPr>
           <w:p>
             <w:r>
-              <w:t>-2.41</w:t>
+              <w:t>0.08</w:t>
+            </w:r>
+          </w:p>
+        </w:tc>
+      </w:tr>
+      <w:tr>
+        <w:tc>
+          <w:tcPr>
+            <w:tcW w:type="dxa" w:w="2160"/>
+          </w:tcPr>
+          <w:p>
+            <w:r>
+              <w:t>ES</w:t>
+            </w:r>
+          </w:p>
+        </w:tc>
+        <w:tc>
+          <w:tcPr>
+            <w:tcW w:type="dxa" w:w="2160"/>
+          </w:tcPr>
+          <w:p>
+            <w:r>
+              <w:t>176.0</w:t>
+            </w:r>
+          </w:p>
+        </w:tc>
+        <w:tc>
+          <w:tcPr>
+            <w:tcW w:type="dxa" w:w="2160"/>
+          </w:tcPr>
+          <w:p>
+            <w:r>
+              <w:t>-0.99</w:t>
+            </w:r>
+          </w:p>
+        </w:tc>
+        <w:tc>
+          <w:tcPr>
+            <w:tcW w:type="dxa" w:w="2160"/>
+          </w:tcPr>
+          <w:p>
+            <w:r>
+              <w:t>-1.28</w:t>
+            </w:r>
+          </w:p>
+        </w:tc>
+      </w:tr>
+      <w:tr>
+        <w:tc>
+          <w:tcPr>
+            <w:tcW w:type="dxa" w:w="2160"/>
+          </w:tcPr>
+          <w:p>
+            <w:r>
+              <w:t>IT</w:t>
+            </w:r>
+          </w:p>
+        </w:tc>
+        <w:tc>
+          <w:tcPr>
+            <w:tcW w:type="dxa" w:w="2160"/>
+          </w:tcPr>
+          <w:p>
+            <w:r>
+              <w:t>20.2</w:t>
+            </w:r>
+          </w:p>
+        </w:tc>
+        <w:tc>
+          <w:tcPr>
+            <w:tcW w:type="dxa" w:w="2160"/>
+          </w:tcPr>
+          <w:p>
+            <w:r>
+              <w:t>-6.51</w:t>
+            </w:r>
+          </w:p>
+        </w:tc>
+        <w:tc>
+          <w:tcPr>
+            <w:tcW w:type="dxa" w:w="2160"/>
+          </w:tcPr>
+          <w:p>
+            <w:r>
+              <w:t>-1.77</w:t>
+            </w:r>
+          </w:p>
+        </w:tc>
+      </w:tr>
+      <w:tr>
+        <w:tc>
+          <w:tcPr>
+            <w:tcW w:type="dxa" w:w="2160"/>
+          </w:tcPr>
+          <w:p>
+            <w:r>
+              <w:t>NL</w:t>
+            </w:r>
+          </w:p>
+        </w:tc>
+        <w:tc>
+          <w:tcPr>
+            <w:tcW w:type="dxa" w:w="2160"/>
+          </w:tcPr>
+          <w:p>
+            <w:r>
+              <w:t>44.9</w:t>
+            </w:r>
+          </w:p>
+        </w:tc>
+        <w:tc>
+          <w:tcPr>
+            <w:tcW w:type="dxa" w:w="2160"/>
+          </w:tcPr>
+          <w:p>
+            <w:r>
+              <w:t>-7.27</w:t>
+            </w:r>
+          </w:p>
+        </w:tc>
+        <w:tc>
+          <w:tcPr>
+            <w:tcW w:type="dxa" w:w="2160"/>
+          </w:tcPr>
+          <w:p>
+            <w:r>
+              <w:t>-7.07</w:t>
+            </w:r>
+          </w:p>
+        </w:tc>
+      </w:tr>
+      <w:tr>
+        <w:tc>
+          <w:tcPr>
+            <w:tcW w:type="dxa" w:w="2160"/>
+          </w:tcPr>
+          <w:p>
+            <w:r>
+              <w:t>BE</w:t>
+            </w:r>
+          </w:p>
+        </w:tc>
+        <w:tc>
+          <w:tcPr>
+            <w:tcW w:type="dxa" w:w="2160"/>
+          </w:tcPr>
+          <w:p>
+            <w:r>
+              <w:t>21.0</w:t>
+            </w:r>
+          </w:p>
+        </w:tc>
+        <w:tc>
+          <w:tcPr>
+            <w:tcW w:type="dxa" w:w="2160"/>
+          </w:tcPr>
+          <w:p>
+            <w:r>
+              <w:t>-1.87</w:t>
+            </w:r>
+          </w:p>
+        </w:tc>
+        <w:tc>
+          <w:tcPr>
+            <w:tcW w:type="dxa" w:w="2160"/>
+          </w:tcPr>
+          <w:p>
+            <w:r>
+              <w:t>-1.11</w:t>
+            </w:r>
+          </w:p>
+        </w:tc>
+      </w:tr>
+      <w:tr>
+        <w:tc>
+          <w:tcPr>
+            <w:tcW w:type="dxa" w:w="2160"/>
+          </w:tcPr>
+          <w:p>
+            <w:r>
+              <w:t>DK</w:t>
+            </w:r>
+          </w:p>
+        </w:tc>
+        <w:tc>
+          <w:tcPr>
+            <w:tcW w:type="dxa" w:w="2160"/>
+          </w:tcPr>
+          <w:p>
+            <w:r>
+              <w:t>27.4</w:t>
+            </w:r>
+          </w:p>
+        </w:tc>
+        <w:tc>
+          <w:tcPr>
+            <w:tcW w:type="dxa" w:w="2160"/>
+          </w:tcPr>
+          <w:p>
+            <w:r>
+              <w:t>-0.24</w:t>
+            </w:r>
+          </w:p>
+        </w:tc>
+        <w:tc>
+          <w:tcPr>
+            <w:tcW w:type="dxa" w:w="2160"/>
+          </w:tcPr>
+          <w:p>
+            <w:r>
+              <w:t>-0.55</w:t>
+            </w:r>
+          </w:p>
+        </w:tc>
+      </w:tr>
+      <w:tr>
+        <w:tc>
+          <w:tcPr>
+            <w:tcW w:type="dxa" w:w="2160"/>
+          </w:tcPr>
+          <w:p>
+            <w:r>
+              <w:t>AT</w:t>
+            </w:r>
+          </w:p>
+        </w:tc>
+        <w:tc>
+          <w:tcPr>
+            <w:tcW w:type="dxa" w:w="2160"/>
+          </w:tcPr>
+          <w:p>
+            <w:r>
+              <w:t>2.4</w:t>
+            </w:r>
+          </w:p>
+        </w:tc>
+        <w:tc>
+          <w:tcPr>
+            <w:tcW w:type="dxa" w:w="2160"/>
+          </w:tcPr>
+          <w:p>
+            <w:r>
+              <w:t>-1.56</w:t>
+            </w:r>
+          </w:p>
+        </w:tc>
+        <w:tc>
+          <w:tcPr>
+            <w:tcW w:type="dxa" w:w="2160"/>
+          </w:tcPr>
+          <w:p>
+            <w:r>
+              <w:t>-1.65</w:t>
+            </w:r>
+          </w:p>
+        </w:tc>
+      </w:tr>
+      <w:tr>
+        <w:tc>
+          <w:tcPr>
+            <w:tcW w:type="dxa" w:w="2160"/>
+          </w:tcPr>
+          <w:p>
+            <w:r>
+              <w:t>PL</w:t>
+            </w:r>
+          </w:p>
+        </w:tc>
+        <w:tc>
+          <w:tcPr>
+            <w:tcW w:type="dxa" w:w="2160"/>
+          </w:tcPr>
+          <w:p>
+            <w:r>
+              <w:t>62.4</w:t>
+            </w:r>
+          </w:p>
+        </w:tc>
+        <w:tc>
+          <w:tcPr>
+            <w:tcW w:type="dxa" w:w="2160"/>
+          </w:tcPr>
+          <w:p>
+            <w:r>
+              <w:t>-1.68</w:t>
+            </w:r>
+          </w:p>
+        </w:tc>
+        <w:tc>
+          <w:tcPr>
+            <w:tcW w:type="dxa" w:w="2160"/>
+          </w:tcPr>
+          <w:p>
+            <w:r>
+              <w:t>-1.91</w:t>
+            </w:r>
+          </w:p>
+        </w:tc>
+      </w:tr>
+      <w:tr>
+        <w:tc>
+          <w:tcPr>
+            <w:tcW w:type="dxa" w:w="2160"/>
+          </w:tcPr>
+          <w:p>
+            <w:r>
+              <w:t>SE</w:t>
+            </w:r>
+          </w:p>
+        </w:tc>
+        <w:tc>
+          <w:tcPr>
+            <w:tcW w:type="dxa" w:w="2160"/>
+          </w:tcPr>
+          <w:p>
+            <w:r>
+              <w:t>-16.1</w:t>
+            </w:r>
+          </w:p>
+        </w:tc>
+        <w:tc>
+          <w:tcPr>
+            <w:tcW w:type="dxa" w:w="2160"/>
+          </w:tcPr>
+          <w:p>
+            <w:r>
+              <w:t>-0.73</w:t>
+            </w:r>
+          </w:p>
+        </w:tc>
+        <w:tc>
+          <w:tcPr>
+            <w:tcW w:type="dxa" w:w="2160"/>
+          </w:tcPr>
+          <w:p>
+            <w:r>
+              <w:t>-0.12</w:t>
+            </w:r>
+          </w:p>
+        </w:tc>
+      </w:tr>
+      <w:tr>
+        <w:tc>
+          <w:tcPr>
+            <w:tcW w:type="dxa" w:w="2160"/>
+          </w:tcPr>
+          <w:p>
+            <w:r>
+              <w:t>NO</w:t>
+            </w:r>
+          </w:p>
+        </w:tc>
+        <w:tc>
+          <w:tcPr>
+            <w:tcW w:type="dxa" w:w="2160"/>
+          </w:tcPr>
+          <w:p>
+            <w:r>
+              <w:t>32.3</w:t>
+            </w:r>
+          </w:p>
+        </w:tc>
+        <w:tc>
+          <w:tcPr>
+            <w:tcW w:type="dxa" w:w="2160"/>
+          </w:tcPr>
+          <w:p>
+            <w:r>
+              <w:t>-19.17</w:t>
+            </w:r>
+          </w:p>
+        </w:tc>
+        <w:tc>
+          <w:tcPr>
+            <w:tcW w:type="dxa" w:w="2160"/>
+          </w:tcPr>
+          <w:p>
+            <w:r>
+              <w:t>-3.20</w:t>
+            </w:r>
+          </w:p>
+        </w:tc>
+      </w:tr>
+      <w:tr>
+        <w:tc>
+          <w:tcPr>
+            <w:tcW w:type="dxa" w:w="2160"/>
+          </w:tcPr>
+          <w:p>
+            <w:r>
+              <w:t>FI</w:t>
+            </w:r>
+          </w:p>
+        </w:tc>
+        <w:tc>
+          <w:tcPr>
+            <w:tcW w:type="dxa" w:w="2160"/>
+          </w:tcPr>
+          <w:p>
+            <w:r>
+              <w:t>23.6</w:t>
+            </w:r>
+          </w:p>
+        </w:tc>
+        <w:tc>
+          <w:tcPr>
+            <w:tcW w:type="dxa" w:w="2160"/>
+          </w:tcPr>
+          <w:p>
+            <w:r>
+              <w:t>-2.13</w:t>
+            </w:r>
+          </w:p>
+        </w:tc>
+        <w:tc>
+          <w:tcPr>
+            <w:tcW w:type="dxa" w:w="2160"/>
+          </w:tcPr>
+          <w:p>
+            <w:r>
+              <w:t>-1.78</w:t>
             </w:r>
           </w:p>
         </w:tc>
@@ -1848,7 +1980,7 @@
           </w:tcPr>
           <w:p>
             <w:r>
-              <w:t>253.0</w:t>
+              <w:t>89.2</w:t>
             </w:r>
           </w:p>
         </w:tc>
@@ -1858,7 +1990,7 @@
           </w:tcPr>
           <w:p>
             <w:r>
-              <w:t>0.01</w:t>
+              <w:t>-0.81</w:t>
             </w:r>
           </w:p>
         </w:tc>
@@ -1868,175 +2000,7 @@
           </w:tcPr>
           <w:p>
             <w:r>
-              <w:t>-0.53</w:t>
-            </w:r>
-          </w:p>
-        </w:tc>
-      </w:tr>
-      <w:tr>
-        <w:tc>
-          <w:tcPr>
-            <w:tcW w:type="dxa" w:w="2160"/>
-          </w:tcPr>
-          <w:p>
-            <w:r>
-              <w:t>IT</w:t>
-            </w:r>
-          </w:p>
-        </w:tc>
-        <w:tc>
-          <w:tcPr>
-            <w:tcW w:type="dxa" w:w="2160"/>
-          </w:tcPr>
-          <w:p>
-            <w:r>
-              <w:t>27.4</w:t>
-            </w:r>
-          </w:p>
-        </w:tc>
-        <w:tc>
-          <w:tcPr>
-            <w:tcW w:type="dxa" w:w="2160"/>
-          </w:tcPr>
-          <w:p>
-            <w:r>
-              <w:t>0.04</w:t>
-            </w:r>
-          </w:p>
-        </w:tc>
-        <w:tc>
-          <w:tcPr>
-            <w:tcW w:type="dxa" w:w="2160"/>
-          </w:tcPr>
-          <w:p>
-            <w:r>
-              <w:t>0.07</w:t>
-            </w:r>
-          </w:p>
-        </w:tc>
-      </w:tr>
-      <w:tr>
-        <w:tc>
-          <w:tcPr>
-            <w:tcW w:type="dxa" w:w="2160"/>
-          </w:tcPr>
-          <w:p>
-            <w:r>
-              <w:t>NL</w:t>
-            </w:r>
-          </w:p>
-        </w:tc>
-        <w:tc>
-          <w:tcPr>
-            <w:tcW w:type="dxa" w:w="2160"/>
-          </w:tcPr>
-          <w:p>
-            <w:r>
-              <w:t>114.2</w:t>
-            </w:r>
-          </w:p>
-        </w:tc>
-        <w:tc>
-          <w:tcPr>
-            <w:tcW w:type="dxa" w:w="2160"/>
-          </w:tcPr>
-          <w:p>
-            <w:r>
-              <w:t>0.03</w:t>
-            </w:r>
-          </w:p>
-        </w:tc>
-        <w:tc>
-          <w:tcPr>
-            <w:tcW w:type="dxa" w:w="2160"/>
-          </w:tcPr>
-          <w:p>
-            <w:r>
-              <w:t>0.03</w:t>
-            </w:r>
-          </w:p>
-        </w:tc>
-      </w:tr>
-      <w:tr>
-        <w:tc>
-          <w:tcPr>
-            <w:tcW w:type="dxa" w:w="2160"/>
-          </w:tcPr>
-          <w:p>
-            <w:r>
-              <w:t>NO</w:t>
-            </w:r>
-          </w:p>
-        </w:tc>
-        <w:tc>
-          <w:tcPr>
-            <w:tcW w:type="dxa" w:w="2160"/>
-          </w:tcPr>
-          <w:p>
-            <w:r>
-              <w:t>-25.3</w:t>
-            </w:r>
-          </w:p>
-        </w:tc>
-        <w:tc>
-          <w:tcPr>
-            <w:tcW w:type="dxa" w:w="2160"/>
-          </w:tcPr>
-          <w:p>
-            <w:r>
-              <w:t>0.00</w:t>
-            </w:r>
-          </w:p>
-        </w:tc>
-        <w:tc>
-          <w:tcPr>
-            <w:tcW w:type="dxa" w:w="2160"/>
-          </w:tcPr>
-          <w:p>
-            <w:r>
-              <w:t>-0.05</w:t>
-            </w:r>
-          </w:p>
-        </w:tc>
-      </w:tr>
-      <w:tr>
-        <w:tc>
-          <w:tcPr>
-            <w:tcW w:type="dxa" w:w="2160"/>
-          </w:tcPr>
-          <w:p>
-            <w:r>
-              <w:t>PL</w:t>
-            </w:r>
-          </w:p>
-        </w:tc>
-        <w:tc>
-          <w:tcPr>
-            <w:tcW w:type="dxa" w:w="2160"/>
-          </w:tcPr>
-          <w:p>
-            <w:r>
-              <w:t>80.0</w:t>
-            </w:r>
-          </w:p>
-        </w:tc>
-        <w:tc>
-          <w:tcPr>
-            <w:tcW w:type="dxa" w:w="2160"/>
-          </w:tcPr>
-          <w:p>
-            <w:r>
-              <w:t>0.06</w:t>
-            </w:r>
-          </w:p>
-        </w:tc>
-        <w:tc>
-          <w:tcPr>
-            <w:tcW w:type="dxa" w:w="2160"/>
-          </w:tcPr>
-          <w:p>
-            <w:r>
-              <w:t>0.13</w:t>
+              <w:t>-0.74</w:t>
             </w:r>
           </w:p>
         </w:tc>
@@ -2058,7 +2022,7 @@
           </w:tcPr>
           <w:p>
             <w:r>
-              <w:t>34.2</w:t>
+              <w:t>52.0</w:t>
             </w:r>
           </w:p>
         </w:tc>
@@ -2068,7 +2032,7 @@
           </w:tcPr>
           <w:p>
             <w:r>
-              <w:t>0.14</w:t>
+              <w:t>-0.81</w:t>
             </w:r>
           </w:p>
         </w:tc>
@@ -2078,7 +2042,7 @@
           </w:tcPr>
           <w:p>
             <w:r>
-              <w:t>-0.04</w:t>
+              <w:t>-0.85</w:t>
             </w:r>
           </w:p>
         </w:tc>
@@ -2090,7 +2054,7 @@
           </w:tcPr>
           <w:p>
             <w:r>
-              <w:t>SE</w:t>
+              <w:t>CZ</w:t>
             </w:r>
           </w:p>
         </w:tc>
@@ -2100,7 +2064,7 @@
           </w:tcPr>
           <w:p>
             <w:r>
-              <w:t>-8.2</w:t>
+              <w:t>16.2</w:t>
             </w:r>
           </w:p>
         </w:tc>
@@ -2110,7 +2074,7 @@
           </w:tcPr>
           <w:p>
             <w:r>
-              <w:t>0.00</w:t>
+              <w:t>-1.97</w:t>
             </w:r>
           </w:p>
         </w:tc>
@@ -2120,7 +2084,49 @@
           </w:tcPr>
           <w:p>
             <w:r>
-              <w:t>-0.04</w:t>
+              <w:t>-1.36</w:t>
+            </w:r>
+          </w:p>
+        </w:tc>
+      </w:tr>
+      <w:tr>
+        <w:tc>
+          <w:tcPr>
+            <w:tcW w:type="dxa" w:w="2160"/>
+          </w:tcPr>
+          <w:p>
+            <w:r>
+              <w:t>CH</w:t>
+            </w:r>
+          </w:p>
+        </w:tc>
+        <w:tc>
+          <w:tcPr>
+            <w:tcW w:type="dxa" w:w="2160"/>
+          </w:tcPr>
+          <w:p>
+            <w:r>
+              <w:t>-18.6</w:t>
+            </w:r>
+          </w:p>
+        </w:tc>
+        <w:tc>
+          <w:tcPr>
+            <w:tcW w:type="dxa" w:w="2160"/>
+          </w:tcPr>
+          <w:p>
+            <w:r>
+              <w:t>-4.87</w:t>
+            </w:r>
+          </w:p>
+        </w:tc>
+        <w:tc>
+          <w:tcPr>
+            <w:tcW w:type="dxa" w:w="2160"/>
+          </w:tcPr>
+          <w:p>
+            <w:r>
+              <w:t>-0.52</w:t>
             </w:r>
           </w:p>
         </w:tc>
@@ -2237,7 +2243,7 @@
           </w:tcPr>
           <w:p>
             <w:r>
-              <w:t>-0.041</w:t>
+              <w:t>-0.021</w:t>
             </w:r>
           </w:p>
         </w:tc>
@@ -2247,7 +2253,7 @@
           </w:tcPr>
           <w:p>
             <w:r>
-              <w:t>[-0.049,-0.034]</w:t>
+              <w:t>[-0.175,0.122]</w:t>
             </w:r>
           </w:p>
         </w:tc>
@@ -2289,7 +2295,7 @@
           </w:tcPr>
           <w:p>
             <w:r>
-              <w:t>0.115</w:t>
+              <w:t>0.071</w:t>
             </w:r>
           </w:p>
         </w:tc>
@@ -2299,7 +2305,7 @@
           </w:tcPr>
           <w:p>
             <w:r>
-              <w:t>[0.107,0.123]</w:t>
+              <w:t>[0.020,0.142]</w:t>
             </w:r>
           </w:p>
         </w:tc>
@@ -2341,7 +2347,7 @@
           </w:tcPr>
           <w:p>
             <w:r>
-              <w:t>-1.134</w:t>
+              <w:t>-0.883</w:t>
             </w:r>
           </w:p>
         </w:tc>
@@ -2351,7 +2357,7 @@
           </w:tcPr>
           <w:p>
             <w:r>
-              <w:t>[-1.231,-1.048]</w:t>
+              <w:t>[-1.547,-0.365]</w:t>
             </w:r>
           </w:p>
         </w:tc>
@@ -2393,7 +2399,7 @@
           </w:tcPr>
           <w:p>
             <w:r>
-              <w:t>0.010</w:t>
+              <w:t>0.007</w:t>
             </w:r>
           </w:p>
         </w:tc>
@@ -2403,7 +2409,7 @@
           </w:tcPr>
           <w:p>
             <w:r>
-              <w:t>[0.010,0.010]</w:t>
+              <w:t>[0.003,0.011]</w:t>
             </w:r>
           </w:p>
         </w:tc>
@@ -2445,7 +2451,7 @@
           </w:tcPr>
           <w:p>
             <w:r>
-              <w:t>0.048</w:t>
+              <w:t>0.060</w:t>
             </w:r>
           </w:p>
         </w:tc>
@@ -2455,7 +2461,7 @@
           </w:tcPr>
           <w:p>
             <w:r>
-              <w:t>[0.042,0.053]</w:t>
+              <w:t>[-0.231,0.384]</w:t>
             </w:r>
           </w:p>
         </w:tc>
@@ -2497,7 +2503,7 @@
           </w:tcPr>
           <w:p>
             <w:r>
-              <w:t>-0.026</w:t>
+              <w:t>-0.027</w:t>
             </w:r>
           </w:p>
         </w:tc>
@@ -2507,7 +2513,7 @@
           </w:tcPr>
           <w:p>
             <w:r>
-              <w:t>[-0.026,-0.025]</w:t>
+              <w:t>[-0.045,-0.011]</w:t>
             </w:r>
           </w:p>
         </w:tc>
@@ -2559,7 +2565,7 @@
           </w:tcPr>
           <w:p>
             <w:r>
-              <w:t>[-0.000,-0.000]</w:t>
+              <w:t>[-0.095,0.092]</w:t>
             </w:r>
           </w:p>
         </w:tc>
@@ -2653,7 +2659,7 @@
           </w:tcPr>
           <w:p>
             <w:r>
-              <w:t>1.224</w:t>
+              <w:t>0.432</w:t>
             </w:r>
           </w:p>
         </w:tc>
@@ -2663,7 +2669,7 @@
           </w:tcPr>
           <w:p>
             <w:r>
-              <w:t>[1.024,1.470]</w:t>
+              <w:t>[0.257,0.632]</w:t>
             </w:r>
           </w:p>
         </w:tc>
@@ -2705,7 +2711,7 @@
           </w:tcPr>
           <w:p>
             <w:r>
-              <w:t>-0.046</w:t>
+              <w:t>-0.034</w:t>
             </w:r>
           </w:p>
         </w:tc>
@@ -2715,7 +2721,7 @@
           </w:tcPr>
           <w:p>
             <w:r>
-              <w:t>[-0.048,-0.043]</w:t>
+              <w:t>[-0.067,-0.006]</w:t>
             </w:r>
           </w:p>
         </w:tc>
@@ -2757,7 +2763,7 @@
           </w:tcPr>
           <w:p>
             <w:r>
-              <w:t>0.335</w:t>
+              <w:t>0.132</w:t>
             </w:r>
           </w:p>
         </w:tc>
@@ -2767,7 +2773,7 @@
           </w:tcPr>
           <w:p>
             <w:r>
-              <w:t>[0.293,0.380]</w:t>
+              <w:t>[0.028,0.267]</w:t>
             </w:r>
           </w:p>
         </w:tc>
@@ -2809,7 +2815,7 @@
           </w:tcPr>
           <w:p>
             <w:r>
-              <w:t>-0.196</w:t>
+              <w:t>-0.153</w:t>
             </w:r>
           </w:p>
         </w:tc>
@@ -2819,7 +2825,7 @@
           </w:tcPr>
           <w:p>
             <w:r>
-              <w:t>[-0.210,-0.183]</w:t>
+              <w:t>[-0.231,-0.089]</w:t>
             </w:r>
           </w:p>
         </w:tc>
@@ -2861,7 +2867,7 @@
           </w:tcPr>
           <w:p>
             <w:r>
-              <w:t>-0.030</w:t>
+              <w:t>-0.046</w:t>
             </w:r>
           </w:p>
         </w:tc>
@@ -2871,7 +2877,7 @@
           </w:tcPr>
           <w:p>
             <w:r>
-              <w:t>[-0.035,-0.027]</w:t>
+              <w:t>[-0.075,-0.022]</w:t>
             </w:r>
           </w:p>
         </w:tc>
@@ -2913,7 +2919,7 @@
           </w:tcPr>
           <w:p>
             <w:r>
-              <w:t>-0.029</w:t>
+              <w:t>-0.036</w:t>
             </w:r>
           </w:p>
         </w:tc>
@@ -2923,7 +2929,7 @@
           </w:tcPr>
           <w:p>
             <w:r>
-              <w:t>[-0.039,-0.018]</w:t>
+              <w:t>[-0.067,-0.007]</w:t>
             </w:r>
           </w:p>
         </w:tc>
@@ -3421,7 +3427,7 @@
     </w:p>
     <w:p>
       <w:r>
-        <w:t>[17] Publisher Correction: Costs and consequences of wind turbine wake effects arising from uncoordinated wind energy development. Nature Energy (2019). https://doi.org/10.1038/s41560-019-0363-9</w:t>
+        <w:t>[17] Costs and consequences of wind turbine wake effects arising from uncoordinated wind energy development. Nature Energy (2019). https://doi.org/10.1038/s41560-018-0281-2</w:t>
       </w:r>
     </w:p>
     <w:p>
@@ -3431,7 +3437,7 @@
     </w:p>
     <w:p>
       <w:r>
-        <w:t>[19] The Explicit Wake Parametrisation V1.0: a wind farm parametrisation in the mesoscale model WRF. nan (2015). https://doi.org/10.5194/gmdd-8-3481-2015</w:t>
+        <w:t>[19] The Explicit Wake Parametrisation V1.0: a wind farm parametrisation in the mesoscale model WRF. Geoscientific Model Development (2015). https://doi.org/10.5194/gmd-8-3715-2015</w:t>
       </w:r>
     </w:p>
     <w:p>
@@ -3471,17 +3477,22 @@
     </w:p>
     <w:p>
       <w:r>
-        <w:t>[27] Difference-in-Differences with multiple time periods. Journal of Econometrics (2021). https://doi.org/10.1016/j.jeconom.2020.12.001</w:t>
+        <w:t>[27] The central role of the propensity score in observational studies for causal effects. Biometrika (1983). https://doi.org/10.1093/biomet/70.1.41</w:t>
       </w:r>
     </w:p>
     <w:p>
       <w:r>
-        <w:t>[28] Open Power System Data – Frictionless data for electricity system modelling. Applied Energy (2019). https://doi.org/10.1016/j.apenergy.2018.11.097</w:t>
+        <w:t>[28] Difference-in-Differences with multiple time periods. Journal of Econometrics (2021). https://doi.org/10.1016/j.jeconom.2020.12.001</w:t>
       </w:r>
     </w:p>
     <w:p>
       <w:r>
-        <w:t>[29] Future electricity demand for Europe: Unraveling the dynamics of the Temperature Response Function. Applied Energy (2024). https://doi.org/10.1016/j.apenergy.2024.123387</w:t>
+        <w:t>[29] Open Power System Data – Frictionless data for electricity system modelling. Applied Energy (2019). https://doi.org/10.1016/j.apenergy.2018.11.097</w:t>
+      </w:r>
+    </w:p>
+    <w:p>
+      <w:r>
+        <w:t>[30] Future electricity demand for Europe: Unraveling the dynamics of the Temperature Response Function. Applied Energy (2024). https://doi.org/10.1016/j.apenergy.2024.123387</w:t>
       </w:r>
     </w:p>
     <w:p>

</xml_diff>

<commit_message>
R5-R8 claim/reference/consistency audits; ECM reqs refresh; highlights<=85chars; docx rebuilt
Co-Authored-By: Tatsuki Onishi <bougtoir@gmail.com>
</commit_message>
<xml_diff>
--- a/manuscript/manuscript.docx
+++ b/manuscript/manuscript.docx
@@ -47,7 +47,7 @@
         <w:pStyle w:val="ListBullet"/>
       </w:pPr>
       <w:r>
-        <w:t>We define WERR: the share of wind energy offset by heat-driven demand caused by deployment.</w:t>
+        <w:t>WERR: share of wind energy offset by deployment-linked heat demand.</w:t>
       </w:r>
     </w:p>
     <w:p>
@@ -55,7 +55,7 @@
         <w:pStyle w:val="ListBullet"/>
       </w:pPr>
       <w:r>
-        <w:t>22 MJJAS seasons of ERA5 plus 140k registered turbines; moisture flux reconstructed from pressure levels.</w:t>
+        <w:t>22 warm seasons of ERA5 and a 140k-turbine provenance-ledgered register.</w:t>
       </w:r>
     </w:p>
     <w:p>
@@ -63,7 +63,7 @@
         <w:pStyle w:val="ListBullet"/>
       </w:pPr>
       <w:r>
-        <w:t>Four complementary observational designs plus an 11-check falsification battery.</w:t>
+        <w:t>Four observational designs plus an 11-check falsification battery.</w:t>
       </w:r>
     </w:p>
     <w:p>
@@ -71,7 +71,7 @@
         <w:pStyle w:val="ListBullet"/>
       </w:pPr>
       <w:r>
-        <w:t>Pooled WERR -0.036 [-0.067,-0.007]: no robust aggregate rebound; localized positives exist.</w:t>
+        <w:t>Pooled WERR -0.036 [-0.067,-0.007]: no robust rebound.</w:t>
       </w:r>
     </w:p>
     <w:p>
@@ -79,7 +79,7 @@
         <w:pStyle w:val="ListBullet"/>
       </w:pPr>
       <w:r>
-        <w:t>Production WRF counterfactual suite (6 scenarios × 4 events × 3 members) is specified but not run.</w:t>
+        <w:t>Production WRF counterfactual suite designed but not executed.</w:t>
       </w:r>
     </w:p>
     <w:p>
@@ -600,7 +600,7 @@
     </w:p>
     <w:p>
       <w:r>
-        <w:t>Numerically, a β of 0.5×10⁻⁴ °C/MW on the North-Sea–Denmark/Germany corridor corresponds, at that region's mean 2021 exposure, to an order-of-magnitude 0.1 °C contribution to the regional Tmax anomaly — detectable, but two orders below the anomaly of a major heatwave (several °C). The sign pattern (positive where exposure is dense and maritime, null-to-negative elsewhere) survives the BH-FDR correction in four of six regional tests.</w:t>
+        <w:t>Numerically, the North-Sea–Denmark/Germany coefficient (5.0×10⁻⁴ °C/MW) at event-mean exposure implies a cluster-scale contribution of order 1–2 °C to the regional Tmax anomaly on positive corridors, with comparable-magnitude negative implied anomalies on Atlantic/domain regions — the sign pattern (positive where exposure is dense and maritime, null-to-negative elsewhere) survives the BH-FDR correction in four of six regional tests.</w:t>
       </w:r>
     </w:p>
     <w:p>

</xml_diff>

<commit_message>
Finishing pass: dT audit, demand/shrinkage documentation, falsification inventory, review fixes, FINAL zips
- r1_demand: bootstrap restricted to train years; duplicate months preserved
- r1_werr: pooled MC draws shared region coefficients once per replicate
- Makefile acquire: registers/OPSD downloads + OSM extraction + MaStR parse
- manuscript: regional dT medians stated; demand wording calibrated;
  shrinkage fully documented; battery renamed falsification-and-sensitivity
- falsification_inventory.csv + dT_audit.json added; submission artifacts
  re-synced; ECM_*_FINAL.zip hash-verified
- p12_qc ALL PASS; pytest 3/3 PASS

Co-Authored-By: Tatsuki Onishi <bougtoir@gmail.com>
</commit_message>
<xml_diff>
--- a/manuscript/manuscript.docx
+++ b/manuscript/manuscript.docx
@@ -31,7 +31,7 @@
     </w:p>
     <w:p>
       <w:r>
-        <w:t>Large-scale extraction of kinetic energy by wind turbines perturbs the atmospheric boundary layer and, plausibly, downstream moisture transport and temperature. Whether this perturbation materially alters the net useful energy benefit of wind power through heat-related electricity demand is an open question. We introduce the Wind-induced Electricity Rebound Ratio (WERR = ΔE_heat / E_wind), the fraction of generated wind energy offset by additional cooling-season demand associated with the deployment footprint. Using 22 MJJAS seasons (2000–2021) of ERA5 reanalysis at 1.5°, a harmonized register of 140,010 European turbines (≈97 GW by 2021), and OPSD electricity records, we reconstruct column-integrated moisture flux and its convergence, define heatwaves by five criteria, and estimate effects with four complementary designs: regional panel regression, circulation-matched analogs, a cell × year two-way fixed-effects difference-in-differences, and an 11-check falsification battery. Effects on regional maximum temperature are small and spatially heterogeneous (≈0.4–0.6×10⁻³ °C per MW of upstream exposure on North-Sea corridors, ≈0 for France). Propagated through a validated demand model, the pooled WERR is -0.036 [95% CI -0.067, -0.007] across 3,017 heatwave events — i.e., no robust aggregate rebound, with localized positive values (up to ~0.3 in the Low Countries) where upstream exposure is dense and wind generation small. Large-eddy counterfactuals were designed but not executed on the available budget; production WRF configurations accompany the replication package.</w:t>
+        <w:t>Large-scale extraction of kinetic energy by wind turbines perturbs the atmospheric boundary layer and, plausibly, downstream moisture transport and temperature. Whether this perturbation materially alters the net useful energy benefit of wind power through heat-related electricity demand is an open question. We introduce the Wind-induced Electricity Rebound Ratio (WERR = ΔE_heat / E_wind), the fraction of generated wind energy offset by additional cooling-season demand associated with the deployment footprint. Using 22 MJJAS seasons (2000–2021) of ERA5 reanalysis at 1.5°, a harmonized register of 140,010 European turbines (≈97 GW by 2021), and OPSD electricity records, we reconstruct column-integrated moisture flux and its convergence, define heatwaves by five criteria, and estimate effects with four complementary designs: regional panel regression, circulation-matched analogs, a cell × year two-way fixed-effects difference-in-differences, plus a falsification-and-sensitivity battery (11 executed checks). Effects on regional maximum temperature are spatially heterogeneous (association-implied event-median ΔT of order 1–2 °C on North-Sea corridors, ≈0 for France, negative elsewhere; per-MW coefficients ≈0.4–0.6×10⁻³ °C). Propagated through a marginal demand-sensitivity model with propagated coefficient uncertainty, the pooled WERR is -0.036 [95% CI -0.067, -0.006] across 3,017 heatwave events — i.e., no robust aggregate rebound, with localized positive values (up to ~0.3 in the Low Countries) where upstream exposure is dense and wind generation small. Large-eddy counterfactuals were designed but not executed on the available budget; production WRF configurations accompany the replication package.</w:t>
       </w:r>
     </w:p>
     <w:p>
@@ -63,7 +63,7 @@
         <w:pStyle w:val="ListBullet"/>
       </w:pPr>
       <w:r>
-        <w:t>Four observational designs plus an 11-check falsification battery.</w:t>
+        <w:t>Four designs plus a falsification-and-sensitivity battery (11 checks).</w:t>
       </w:r>
     </w:p>
     <w:p>
@@ -71,7 +71,7 @@
         <w:pStyle w:val="ListBullet"/>
       </w:pPr>
       <w:r>
-        <w:t>Pooled WERR -0.036 [-0.067,-0.007]: no robust rebound.</w:t>
+        <w:t>Pooled WERR -0.036 [-0.067,-0.006]: no robust rebound.</w:t>
       </w:r>
     </w:p>
     <w:p>
@@ -512,7 +512,7 @@
     </w:p>
     <w:p>
       <w:r>
-        <w:t>(D4) Falsification battery: downwind (sign-flipped) exposure, placebo outcome shifted +45 d, SST as weak outcome, alternative kernels, leave-one-region-out, alternative heatwave definitions; Benjamini–Hochberg FDR control across the primary family.</w:t>
+        <w:t>(D4) Falsification-and-sensitivity battery: downwind (sign-flipped) exposure, placebo outcome shifted +45 d, SST as weak outcome, alternative kernels, leave-one-region-out, alternative heatwave definitions; Benjamini–Hochberg FDR control across the primary family.</w:t>
       </w:r>
     </w:p>
     <w:p>
@@ -543,7 +543,7 @@
         <w:t>30</w:t>
       </w:r>
       <w:r>
-        <w:t>. For each primary heatwave event we compute the association-implied temperature change ΔT = β_region·WFI, translate it to energy with the demand slope and event duration, and divide by the event's actual wind generation: WERR = ΔE_heat/E_wind. Uncertainty is bootstrapped over events, with Monte-Carlo draws of the atmospheric and demand coefficients inside each replicate (B=1000).</w:t>
+        <w:t>. The slope is a local marginal temperature sensitivity, estimated on deseasonalized residuals; out-of-sample R² is low or negative for many countries (Table 3), so we propagate coefficient uncertainty rather than claim predictive skill. Slope standard errors use a month-block bootstrap (B=500, months resampled with replacement within the training years). Instability is flagged when the slope changes sign across blocked-CV folds or |slope|/SE&lt;1; unstable slopes are shrunk via a normal–normal empirical-Bayes step toward the inverse-variance pooled mean (μ≈27 MW/°C, between-country τ²≈9.5×10³): posterior mean = (w·x + μ/τ²)/(w + 1/τ²) with w = 1/SE². The rule uses only training-period slope properties — never the WERR sign or magnitude — and affects GB (fixed at 0) plus DK, AT, NO, FI and CH. For each primary heatwave event we compute the association-implied temperature change ΔT = β_region·WFI, translate it to energy with the demand slope and event duration, and divide by the event's actual wind generation: WERR = ΔE_heat/E_wind. Uncertainty is bootstrapped over events, with Monte-Carlo draws of the atmospheric and demand coefficients inside each replicate (B=1000).</w:t>
       </w:r>
     </w:p>
     <w:p>
@@ -600,7 +600,7 @@
     </w:p>
     <w:p>
       <w:r>
-        <w:t>Numerically, the North-Sea–Denmark/Germany coefficient (5.0×10⁻⁴ °C/MW) at event-mean exposure implies a cluster-scale contribution of order 1–2 °C to the regional Tmax anomaly on positive corridors, with comparable-magnitude negative implied anomalies on Atlantic/domain regions — the sign pattern (positive where exposure is dense and maritime, null-to-negative elsewhere) survives the BH-FDR correction in four of six regional tests.</w:t>
+        <w:t>Numerically, event-mean exposure implies regional ΔT medians of +1.8 °C (North-Sea–Denmark/Germany), +2.0 °C (UK-offshore), +1.4 °C (Low Countries), -0.6 °C (Iberia), -1.9 °C (domain) and ≈0 °C for France — i.e. implied anomalies of order 1–2 °C in either sign on the high-exposure corridors rather than a uniformly small effect. The sign pattern (positive where exposure is dense and maritime, null-to-negative elsewhere) survives the BH-FDR correction in four of six regional tests.</w:t>
       </w:r>
     </w:p>
     <w:p>
@@ -644,7 +644,7 @@
     </w:p>
     <w:p>
       <w:r>
-        <w:t>The battery (Fig. 7) largely behaves as required: the sign-flipped (downwind) exposure is null (p=0.09), the +45-day placebo is null (p=0.48), SST as outcome is null (p=0.39). Kernel choice does matter: alternative decay scales change the sign of the domain coefficient, so the domain-level estimate is not kernel-robust. The off-season control could not be run because the download is MJJAS-only — flagged as a limitation. After BH-FDR, 4 of 6 regional primary tests survive.</w:t>
+        <w:t>The battery (Fig. 7; 11 executed checks — 3 falsification controls, 3 kernel/decay sensitivities and 5 leave-one-region-out robustness tests; the Nov–Mar off-season control is infeasible on the MJJAS-only archive and is documented rather than claimed) largely behaves as required: the sign-flipped (downwind) exposure is null (p=0.09), the +45-day placebo is null (p=0.48), SST as outcome is null (p=0.39). Kernel choice does matter: alternative decay scales change the sign of the domain coefficient, so the domain-level estimate is not kernel-robust. The off-season control could not be run because the download is MJJAS-only — flagged as a limitation. After BH-FDR, 4 of 6 regional primary tests survive.</w:t>
       </w:r>
     </w:p>
     <w:p>
@@ -675,7 +675,7 @@
     </w:p>
     <w:p>
       <w:r>
-        <w:t>Fig. 8 and Table 4 give per-event WERR for 3,017 events. The pooled estimate is -0.036 [-0.067, -0.007] — no robust positive rebound. Regionally, WERR is positive on the dense North-Sea corridors (BE 0.07, NL 0.13, DK 0.060, DE 0.007), ~0 for France, and negative where the panel coefficient is negative. The pooled negative sign reflects the negative domain coefficient applied to countries mapped to it; the signed heterogeneity — not the sign — is the robust feature.</w:t>
+        <w:t>Fig. 8 and Table 4 give per-event WERR for 3,017 events. The pooled estimate is -0.036 [-0.067, -0.006] — no robust positive rebound. Regionally, WERR is positive on the dense North-Sea corridors (BE 0.07, NL 0.13, DK 0.091, DE 0.007), ~0 for France, and negative where the panel coefficient is negative. The pooled negative sign reflects the negative domain coefficient applied to countries mapped to it; the signed heterogeneity — not the sign — is the robust feature.</w:t>
       </w:r>
     </w:p>
     <w:p>
@@ -738,7 +738,7 @@
     </w:p>
     <w:p>
       <w:r>
-        <w:t>Across 22 warm seasons of reanalysis, four complementary designs and an 11-check falsification battery, large-scale European wind deployment is associated with a small, spatially heterogeneous meteorological signature on warm-season extreme temperature: positive (≈0.4–0.6×10⁻³ °C per MW upstream) on North-Sea corridors, near zero over France, negative elsewhere. Propagated to electricity demand, the pooled Wind-induced Electricity Rebound Ratio is -0.036 [-0.067,-0.007] — i.e., no detectable aggregate rebound, with localized positive values where exposure is dense and generation modest. The mechanism is consistent with a transport-mediated externality rather than a bulk energetic constraint on wind power; the estimated magnitude does not materially alter the net benefit of wind generation at the scale of current European deployment.</w:t>
+        <w:t>Across 22 warm seasons of reanalysis, four complementary designs and a falsification-and-sensitivity battery (11 executed checks), large-scale European wind deployment is associated with a small, spatially heterogeneous meteorological signature on warm-season extreme temperature: positive (≈0.4–0.6×10⁻³ °C per MW upstream) on North-Sea corridors, near zero over France, negative elsewhere. Propagated to electricity demand, the pooled Wind-induced Electricity Rebound Ratio is -0.036 [-0.067,-0.006] — i.e., no detectable aggregate rebound, with localized positive values where exposure is dense and generation modest. The mechanism is consistent with a transport-mediated externality rather than a bulk energetic constraint on wind power; the estimated magnitude does not materially alter the net benefit of wind generation at the scale of current European deployment.</w:t>
       </w:r>
     </w:p>
     <w:p>
@@ -1728,7 +1728,7 @@
           </w:tcPr>
           <w:p>
             <w:r>
-              <w:t>27.4</w:t>
+              <w:t>41.5</w:t>
             </w:r>
           </w:p>
         </w:tc>
@@ -1770,7 +1770,7 @@
           </w:tcPr>
           <w:p>
             <w:r>
-              <w:t>2.4</w:t>
+              <w:t>2.3</w:t>
             </w:r>
           </w:p>
         </w:tc>
@@ -1854,7 +1854,7 @@
           </w:tcPr>
           <w:p>
             <w:r>
-              <w:t>-16.1</w:t>
+              <w:t>-37.0</w:t>
             </w:r>
           </w:p>
         </w:tc>
@@ -1896,7 +1896,7 @@
           </w:tcPr>
           <w:p>
             <w:r>
-              <w:t>32.3</w:t>
+              <w:t>32.9</w:t>
             </w:r>
           </w:p>
         </w:tc>
@@ -2106,7 +2106,7 @@
           </w:tcPr>
           <w:p>
             <w:r>
-              <w:t>-18.6</w:t>
+              <w:t>-17.5</w:t>
             </w:r>
           </w:p>
         </w:tc>
@@ -2243,7 +2243,7 @@
           </w:tcPr>
           <w:p>
             <w:r>
-              <w:t>-0.021</w:t>
+              <w:t>-0.020</w:t>
             </w:r>
           </w:p>
         </w:tc>
@@ -2253,7 +2253,7 @@
           </w:tcPr>
           <w:p>
             <w:r>
-              <w:t>[-0.175,0.122]</w:t>
+              <w:t>[-0.169,0.118]</w:t>
             </w:r>
           </w:p>
         </w:tc>
@@ -2305,7 +2305,7 @@
           </w:tcPr>
           <w:p>
             <w:r>
-              <w:t>[0.020,0.142]</w:t>
+              <w:t>[0.011,0.153]</w:t>
             </w:r>
           </w:p>
         </w:tc>
@@ -2357,7 +2357,7 @@
           </w:tcPr>
           <w:p>
             <w:r>
-              <w:t>[-1.547,-0.365]</w:t>
+              <w:t>[-1.526,-0.384]</w:t>
             </w:r>
           </w:p>
         </w:tc>
@@ -2409,7 +2409,7 @@
           </w:tcPr>
           <w:p>
             <w:r>
-              <w:t>[0.003,0.011]</w:t>
+              <w:t>[0.003,0.012]</w:t>
             </w:r>
           </w:p>
         </w:tc>
@@ -2451,7 +2451,7 @@
           </w:tcPr>
           <w:p>
             <w:r>
-              <w:t>0.060</w:t>
+              <w:t>0.091</w:t>
             </w:r>
           </w:p>
         </w:tc>
@@ -2461,7 +2461,7 @@
           </w:tcPr>
           <w:p>
             <w:r>
-              <w:t>[-0.231,0.384]</w:t>
+              <w:t>[0.049,0.142]</w:t>
             </w:r>
           </w:p>
         </w:tc>
@@ -2513,7 +2513,7 @@
           </w:tcPr>
           <w:p>
             <w:r>
-              <w:t>[-0.045,-0.011]</w:t>
+              <w:t>[-0.051,-0.006]</w:t>
             </w:r>
           </w:p>
         </w:tc>
@@ -2565,7 +2565,7 @@
           </w:tcPr>
           <w:p>
             <w:r>
-              <w:t>[-0.095,0.092]</w:t>
+              <w:t>[-0.097,0.092]</w:t>
             </w:r>
           </w:p>
         </w:tc>
@@ -2669,7 +2669,7 @@
           </w:tcPr>
           <w:p>
             <w:r>
-              <w:t>[0.257,0.632]</w:t>
+              <w:t>[0.234,0.662]</w:t>
             </w:r>
           </w:p>
         </w:tc>
@@ -2721,7 +2721,7 @@
           </w:tcPr>
           <w:p>
             <w:r>
-              <w:t>[-0.067,-0.006]</w:t>
+              <w:t>[-0.088,0.014]</w:t>
             </w:r>
           </w:p>
         </w:tc>
@@ -2773,7 +2773,7 @@
           </w:tcPr>
           <w:p>
             <w:r>
-              <w:t>[0.028,0.267]</w:t>
+              <w:t>[-0.009,0.306]</w:t>
             </w:r>
           </w:p>
         </w:tc>
@@ -2825,7 +2825,7 @@
           </w:tcPr>
           <w:p>
             <w:r>
-              <w:t>[-0.231,-0.089]</w:t>
+              <w:t>[-0.227,-0.090]</w:t>
             </w:r>
           </w:p>
         </w:tc>
@@ -2929,7 +2929,7 @@
           </w:tcPr>
           <w:p>
             <w:r>
-              <w:t>[-0.067,-0.007]</w:t>
+              <w:t>[-0.067,-0.006]</w:t>
             </w:r>
           </w:p>
         </w:tc>
@@ -3281,7 +3281,7 @@
           <w:i/>
           <w:sz w:val="18"/>
         </w:rPr>
-        <w:t>Figure 7. Falsification battery coefficients (red: p&lt;0.05).</w:t>
+        <w:t>Figure 7. Falsification-and-sensitivity battery coefficients (red: p&lt;0.05).</w:t>
       </w:r>
     </w:p>
     <w:p>

</xml_diff>

<commit_message>
Final hostile review + numeric hardcode audit pass
- Hostile review (editor + 4 reviewers): stale WERR in cover letter & GA
  fixed; FDR 4/6->5/6; werr_ci -0.007->-0.006; IE/CZ heterogeneity with
  denominator caveats; 'large-eddy'->'Mesoscale WRF'; beta*WFI labeled
  scenario magnitude not causal dT; GB [0,0] footnote; EB mu/tau2 derived
- New generators: make_graphical_abstract.py, build_cover_letter.py,
  numeric_provenance.py; all numbers now generated from canonical outputs
- Gates A-D docs + NUMERIC_PROVENANCE.csv (582 tokens) + FINAL_HANDOFF
- Tests: pytest 3/3, p12_qc PASS, mutation M1-M3 PASS, figs bit-identical
- Verdict: SUBMIT with calibrated claims (residual risks disclosed)
- ECM_submission_HOSTILE_AUDITED.zip sha256 a7c03905be43...
- ECM_reproducibility_HOSTILE_AUDITED.zip sha256 36c79a83087a...

Co-Authored-By: Tatsuki Onishi <bougtoir@gmail.com>
</commit_message>
<xml_diff>
--- a/manuscript/manuscript.docx
+++ b/manuscript/manuscript.docx
@@ -31,7 +31,7 @@
     </w:p>
     <w:p>
       <w:r>
-        <w:t>Large-scale extraction of kinetic energy by wind turbines perturbs the atmospheric boundary layer and, plausibly, downstream moisture transport and temperature. Whether this perturbation materially alters the net useful energy benefit of wind power through heat-related electricity demand is an open question. We introduce the Wind-induced Electricity Rebound Ratio (WERR = ΔE_heat / E_wind), the fraction of generated wind energy offset by additional cooling-season demand associated with the deployment footprint. Using 22 MJJAS seasons (2000–2021) of ERA5 reanalysis at 1.5°, a harmonized register of 140,010 European turbines (≈97 GW by 2021), and OPSD electricity records, we reconstruct column-integrated moisture flux and its convergence, define heatwaves by five criteria, and estimate effects with four complementary designs: regional panel regression, circulation-matched analogs, a cell × year two-way fixed-effects difference-in-differences, plus a falsification-and-sensitivity battery (11 executed checks). Effects on regional maximum temperature are spatially heterogeneous (association-implied event-median ΔT of order 1–2 °C on North-Sea corridors, ≈0 for France, negative elsewhere; per-MW coefficients ≈0.4–0.6×10⁻³ °C). Propagated through a marginal demand-sensitivity model with propagated coefficient uncertainty, the pooled WERR is -0.036 [95% CI -0.067, -0.006] across 3,017 heatwave events — i.e., no robust aggregate rebound, with localized positive values (up to ~0.3 in the Low Countries) where upstream exposure is dense and wind generation small. Large-eddy counterfactuals were designed but not executed on the available budget; production WRF configurations accompany the replication package.</w:t>
+        <w:t>Large-scale extraction of kinetic energy by wind turbines perturbs the atmospheric boundary layer and, plausibly, downstream moisture transport and temperature. Whether this perturbation materially alters the net useful energy benefit of wind power through heat-related electricity demand is an open question. We introduce the Wind-induced Electricity Rebound Ratio (WERR = ΔE_heat / E_wind), the fraction of generated wind energy offset by additional cooling-season demand associated with the deployment footprint. Using 22 MJJAS seasons (2000–2021) of ERA5 reanalysis at 1.5°, a harmonized register of 140,010 European turbines (≈97 GW by 2021), and OPSD electricity records, we reconstruct column-integrated moisture flux and its convergence, define heatwaves by five criteria, and estimate effects with four complementary designs: regional panel regression, circulation-matched analogs, a cell × year two-way fixed-effects difference-in-differences, plus a falsification-and-sensitivity battery (11 executed checks). Effects on regional maximum temperature are spatially heterogeneous (association-implied event-median ΔT of order 1–2 °C on North-Sea corridors, ≈0 for France, negative elsewhere; per-MW coefficients ≈0.4–0.6×10⁻³ °C). Propagated through a marginal demand-sensitivity model with propagated coefficient uncertainty, the pooled WERR is -0.036 [95% CI -0.067, -0.006] across 3,017 heatwave events — i.e., no robust aggregate rebound, with localized positive values (up to ~0.4 in Ireland and ~0.1 in the Low Countries) where upstream exposure is dense and wind generation small. Mesoscale WRF counterfactuals were designed but not executed on the available budget; production WRF configurations accompany the replication package.</w:t>
       </w:r>
     </w:p>
     <w:p>
@@ -600,7 +600,7 @@
     </w:p>
     <w:p>
       <w:r>
-        <w:t>Numerically, event-mean exposure implies regional ΔT medians of +1.8 °C (North-Sea–Denmark/Germany), +2.0 °C (UK-offshore), +1.4 °C (Low Countries), -0.6 °C (Iberia), -1.9 °C (domain) and ≈0 °C for France — i.e. implied anomalies of order 1–2 °C in either sign on the high-exposure corridors rather than a uniformly small effect. The sign pattern (positive where exposure is dense and maritime, null-to-negative elsewhere) survives the BH-FDR correction in four of six regional tests.</w:t>
+        <w:t>Numerically, event-mean exposure implies regional ΔT medians of +1.8 °C (North-Sea–Denmark/Germany), +2.0 °C (UK-offshore), +1.4 °C (Low Countries), -0.6 °C (Iberia), -1.9 °C (domain) and ≈0 °C for France — i.e. implied anomalies of order 1–2 °C in either sign on the high-exposure corridors rather than a uniformly small effect. These are β×WFI scenario magnitudes — the linear response implied by D1 under sustained exposure — not observed turbine-attributable warming; they are upper bounds on the association-implied perturbation and must not be read as measured causal ΔT. The sign pattern (positive where exposure is dense and maritime, null-to-negative elsewhere) survives the BH-FDR correction in 5 of 6 regional tests.</w:t>
       </w:r>
     </w:p>
     <w:p>
@@ -644,7 +644,7 @@
     </w:p>
     <w:p>
       <w:r>
-        <w:t>The battery (Fig. 7; 11 executed checks — 3 falsification controls, 3 kernel/decay sensitivities and 5 leave-one-region-out robustness tests; the Nov–Mar off-season control is infeasible on the MJJAS-only archive and is documented rather than claimed) largely behaves as required: the sign-flipped (downwind) exposure is null (p=0.09), the +45-day placebo is null (p=0.48), SST as outcome is null (p=0.39). Kernel choice does matter: alternative decay scales change the sign of the domain coefficient, so the domain-level estimate is not kernel-robust. The off-season control could not be run because the download is MJJAS-only — flagged as a limitation. After BH-FDR, 4 of 6 regional primary tests survive.</w:t>
+        <w:t>The battery (Fig. 7; 11 executed checks — 3 falsification controls, 3 kernel/decay sensitivities and 5 leave-one-region-out robustness tests; the Nov–Mar off-season control is infeasible on the MJJAS-only archive and is documented rather than claimed) largely behaves as required: the sign-flipped (downwind) exposure is null (p=0.09), the +45-day placebo is null (p=0.48), SST as outcome is null (p=0.39). Kernel choice does matter: alternative decay scales change the sign of the domain coefficient, so the domain-level estimate is not kernel-robust; likewise, dropping either Atlantic region flips the domain coefficient positive, so the domain sign is aggregation-sensitive while corridor-level signs are stable. The off-season control could not be run because the download is MJJAS-only — flagged as a limitation. After BH-FDR, 5 of 6 regional primary tests survive.</w:t>
       </w:r>
     </w:p>
     <w:p>
@@ -675,7 +675,7 @@
     </w:p>
     <w:p>
       <w:r>
-        <w:t>Fig. 8 and Table 4 give per-event WERR for 3,017 events. The pooled estimate is -0.036 [-0.067, -0.006] — no robust positive rebound. Regionally, WERR is positive on the dense North-Sea corridors (BE 0.07, NL 0.13, DK 0.091, DE 0.007), ~0 for France, and negative where the panel coefficient is negative. The pooled negative sign reflects the negative domain coefficient applied to countries mapped to it; the signed heterogeneity — not the sign — is the robust feature.</w:t>
+        <w:t>Fig. 8 and Table 4 give per-event WERR for 3,017 events. The pooled estimate is -0.036 [-0.067, -0.006] — no robust positive rebound. Regionally, WERR is positive on the dense North-Sea corridors (BE 0.07, NL 0.13, DK 0.091, DE 0.007), largest for Ireland (IE 0.43, where wind generation in the denominator is small), ~0 for France, and negative where the panel coefficient is negative. The pooled negative sign reflects the negative domain coefficient applied to countries mapped to it; extreme country values (e.g. CZ -0.88) are association-implied scenario ratios on small denominators, not measured demand offsets — the signed heterogeneity, not the sign, is the robust feature.</w:t>
       </w:r>
     </w:p>
     <w:p>
@@ -2137,7 +2137,7 @@
         <w:rPr>
           <w:b/>
         </w:rPr>
-        <w:t>Table 4. Per-event WERR by country (bootstrap CI over events).</w:t>
+        <w:t>Table 4. Per-event WERR by country (bootstrap CI over events). GB is fixed at zero by the shrinkage rule (slope fixed at 0); its [0,0] interval is a plug-in consequence, not a measured zero.</w:t>
       </w:r>
     </w:p>
     <w:tbl>

</xml_diff>

<commit_message>
Country-day WERR estimand (GATE: overlap audit + reaggregation)
- GATE1: 3,017 events reuse 3,213 unique country-days (mean 5.4x,
  DE 9.9x); each pixel-event used whole-country E_wind denominator
- GATE2: new estimand WERR_CD = sum(dE)/sum(E_wind), generation counted
  once per country-day; coverage-weighted (active-pixel fraction)
- Result: WERR_CD = +0.0009 [-0.0048,+0.0098] vs legacy event-mean
  -0.036; disagreement disclosed (estimand effect: small-denominator
  ratios dominate event mean). Preferred for energy accounting.
- Robustness: 2-way country x year block bootstrap, delta method, LOO,
  unweighted (-0.005) + m2 (+0.001) sensitivities, equal-country (-0.02)
- 'Preregistered'->'prespecified' (no verifiable preregistration)
- Synced: abstract/3.7/conclusions/Tab4, highlights, cover letter, GA,
  manuscript_values.csv; mutation test PASS; p12_qc 13/13, pytest 3/3
- zips sha256: sub 2b75becf..., rep 40b8c68b...

Co-Authored-By: Tatsuki Onishi <bougtoir@gmail.com>
</commit_message>
<xml_diff>
--- a/manuscript/manuscript.docx
+++ b/manuscript/manuscript.docx
@@ -31,7 +31,7 @@
     </w:p>
     <w:p>
       <w:r>
-        <w:t>Large-scale extraction of kinetic energy by wind turbines perturbs the atmospheric boundary layer and, plausibly, downstream moisture transport and temperature. Whether this perturbation materially alters the net useful energy benefit of wind power through heat-related electricity demand is an open question. We introduce the Wind-induced Electricity Rebound Ratio (WERR = ΔE_heat / E_wind), the fraction of generated wind energy offset by additional cooling-season demand associated with the deployment footprint. Using 22 MJJAS seasons (2000–2021) of ERA5 reanalysis at 1.5°, a harmonized register of 140,010 European turbines (≈97 GW by 2021), and OPSD electricity records, we reconstruct column-integrated moisture flux and its convergence, define heatwaves by five criteria, and estimate effects with four complementary designs: regional panel regression, circulation-matched analogs, a cell × year two-way fixed-effects difference-in-differences, plus a falsification-and-sensitivity battery (11 executed checks). Effects on regional maximum temperature are spatially heterogeneous (association-implied event-median ΔT of order 1–2 °C on North-Sea corridors, ≈0 for France, negative elsewhere; per-MW coefficients ≈0.4–0.6×10⁻³ °C). Propagated through a marginal demand-sensitivity model with propagated coefficient uncertainty, the pooled WERR is -0.036 [95% CI -0.067, -0.006] across 3,017 heatwave events — i.e., no robust aggregate rebound, with localized positive values (up to ~0.4 in Ireland and ~0.1 in the Low Countries) where upstream exposure is dense and wind generation small. Mesoscale WRF counterfactuals were designed but not executed on the available budget; production WRF configurations accompany the replication package.</w:t>
+        <w:t>Large-scale extraction of kinetic energy by wind turbines perturbs the atmospheric boundary layer and, plausibly, downstream moisture transport and temperature. Whether this perturbation materially alters the net useful energy benefit of wind power through heat-related electricity demand is an open question. We introduce the Wind-induced Electricity Rebound Ratio (WERR = ΔE_heat / E_wind), the fraction of generated wind energy offset by additional cooling-season demand associated with the deployment footprint. Using 22 MJJAS seasons (2000–2021) of ERA5 reanalysis at 1.5°, a harmonized register of 140,010 European turbines (≈97 GW by 2021), and OPSD electricity records, we reconstruct column-integrated moisture flux and its convergence, define heatwaves by five criteria, and estimate effects with four complementary designs: regional panel regression, circulation-matched analogs, a cell × year two-way fixed-effects difference-in-differences, plus a falsification-and-sensitivity battery (11 executed checks). Effects on regional maximum temperature are spatially heterogeneous (association-implied event-median ΔT of order 1–2 °C on North-Sea corridors, ≈0 for France, negative elsewhere; per-MW coefficients ≈0.4–0.6×10⁻³ °C). Propagated through a marginal demand-sensitivity model with propagated coefficient uncertainty, the event-level mean WERR is -0.036 [95% CI -0.067, -0.006] across 3,017 heatwave events; the energy-accounting country-day estimand (each country's generation counted once per day, 2,362 country-days) gives WERR_CD = 0.0009 [-0.0048, 0.0098] — the event mean overweights small denominators. Neither shows a robust aggregate rebound; localized positive values (up to ~0.4 in Ireland) occur where exposure is dense and generation small. Mesoscale WRF counterfactuals were designed but not executed; production configurations accompany the replication package.</w:t>
       </w:r>
     </w:p>
     <w:p>
@@ -71,7 +71,7 @@
         <w:pStyle w:val="ListBullet"/>
       </w:pPr>
       <w:r>
-        <w:t>Pooled WERR -0.036 [-0.067,-0.006]: no robust rebound.</w:t>
+        <w:t>WERR_CD 0.001 [-0.005,0.010] on country-days; event-mean -0.036.</w:t>
       </w:r>
     </w:p>
     <w:p>
@@ -363,7 +363,7 @@
     </w:p>
     <w:p>
       <w:r>
-        <w:t>Contribution. (i) A harmonized, provenance-ledgered turbine register and upstream-capacity exposure field (WFI) constructed for every day of the record; (ii) a moisture-transport diagnostic suite (column integrated flux, convergence, cross-transect fluxes) aligned with five heatwave definitions; (iii) four complementary identification designs with resampling-based inference appropriate to spatially and temporally dependent data; (iv) a signed, event-level rebound metric WERR with bootstrap uncertainty; (v) a preregistered WRF counterfactual design for future causal closure.</w:t>
+        <w:t>Contribution. (i) A harmonized, provenance-ledgered turbine register and upstream-capacity exposure field (WFI) constructed for every day of the record; (ii) a moisture-transport diagnostic suite (column integrated flux, convergence, cross-transect fluxes) aligned with five heatwave definitions; (iii) four complementary identification designs with resampling-based inference appropriate to spatially and temporally dependent data; (iv) a signed, event-level rebound metric WERR with bootstrap uncertainty; (v) a prespecified WRF counterfactual design for future causal closure.</w:t>
       </w:r>
     </w:p>
     <w:p>
@@ -543,7 +543,7 @@
         <w:t>30</w:t>
       </w:r>
       <w:r>
-        <w:t>. The slope is a local marginal temperature sensitivity, estimated on deseasonalized residuals; out-of-sample R² is low or negative for many countries (Table 3), so we propagate coefficient uncertainty rather than claim predictive skill. Slope standard errors use a month-block bootstrap (B=500, months resampled with replacement within the training years). Instability is flagged when the slope changes sign across blocked-CV folds or |slope|/SE&lt;1; unstable slopes are shrunk via a normal–normal empirical-Bayes step toward the inverse-variance pooled mean (μ≈27 MW/°C, between-country τ²≈9.5×10³): posterior mean = (w·x + μ/τ²)/(w + 1/τ²) with w = 1/SE². The rule uses only training-period slope properties — never the WERR sign or magnitude — and affects GB (fixed at 0) plus DK, AT, NO, FI and CH. For each primary heatwave event we compute the association-implied temperature change ΔT = β_region·WFI, translate it to energy with the demand slope and event duration, and divide by the event's actual wind generation: WERR = ΔE_heat/E_wind. Uncertainty is bootstrapped over events, with Monte-Carlo draws of the atmospheric and demand coefficients inside each replicate (B=1000).</w:t>
+        <w:t>. The slope is a local marginal temperature sensitivity, estimated on deseasonalized residuals; out-of-sample R² is low or negative for many countries (Table 3), so we propagate coefficient uncertainty rather than claim predictive skill. Slope standard errors use a month-block bootstrap (B=500, months resampled with replacement within the training years). Instability is flagged when the slope changes sign across blocked-CV folds or |slope|/SE&lt;1; unstable slopes are shrunk via a normal–normal empirical-Bayes step toward the inverse-variance pooled mean (μ≈27 MW/°C, between-country τ²≈9.5×10³): posterior mean = (w·x + μ/τ²)/(w + 1/τ²) with w = 1/SE². The rule uses only training-period slope properties — never the WERR sign or magnitude — and affects GB (fixed at 0) plus DK, AT, NO, FI and CH. For each primary heatwave event we compute the association-implied temperature change ΔT = β_region·WFI, translate it to energy with the demand slope and event duration, and divide by the event's actual wind generation: WERR = ΔE_heat/E_wind. Uncertainty is bootstrapped over events, with Monte-Carlo draws of the atmospheric and demand coefficients inside each replicate (B=1000). Because pixel-level events share whole-country denominators (3,017 events reuse only ≈3.2k unique country-days, mean multiplicity 5.4), we also define a country-day estimand: each country's actual wind generation enters at most once per day, and the demand response is applied once per country-day, weighted by the fraction of the country's event pixels under an active event; WERR_CD is the ratio of summed implied demand to summed generation, with uncertainty from a two-way (country × year) block bootstrap plus delta-method propagation of coefficient standard errors.</w:t>
       </w:r>
     </w:p>
     <w:p>
@@ -675,7 +675,7 @@
     </w:p>
     <w:p>
       <w:r>
-        <w:t>Fig. 8 and Table 4 give per-event WERR for 3,017 events. The pooled estimate is -0.036 [-0.067, -0.006] — no robust positive rebound. Regionally, WERR is positive on the dense North-Sea corridors (BE 0.07, NL 0.13, DK 0.091, DE 0.007), largest for Ireland (IE 0.43, where wind generation in the denominator is small), ~0 for France, and negative where the panel coefficient is negative. The pooled negative sign reflects the negative domain coefficient applied to countries mapped to it; extreme country values (e.g. CZ -0.88) are association-implied scenario ratios on small denominators, not measured demand offsets — the signed heterogeneity, not the sign, is the robust feature.</w:t>
+        <w:t>Fig. 8 and Table 4 give per-event WERR for 3,017 events. The pooled estimate is -0.036 [-0.067, -0.006] — no robust positive rebound. Regionally, WERR is positive on the dense North-Sea corridors (BE 0.07, NL 0.13, DK 0.091, DE 0.007), largest for Ireland (IE 0.43, where wind generation in the denominator is small), ~0 for France, and negative where the panel coefficient is negative. The pooled negative sign reflects the negative domain coefficient applied to countries mapped to it; extreme country values (e.g. CZ -0.88) are association-implied scenario ratios on small denominators, not measured demand offsets — the signed heterogeneity, not the sign, is the robust feature. On the country-day estimand (Table 4, right column), WERR_CD is 0.0009 [-0.0048, 0.0098] over 2,362 eligible country-days — statistically indistinguishable from zero and directionally opposite to the event-average. The disagreement is an estimand effect, not a data conflict: the event mean averages per-event ratios (small denominators dominate; each country's generation is counted once per event, i.e. many times per day), whereas WERR_CD sums energies once per country-day. We prefer WERR_CD for energy accounting and report both (equal-country mean -0.0199; unweighted coverage -0.0049; alternate demand model 0.0012; leave-one-country-out range -0.0004 to 0.0029).</w:t>
       </w:r>
     </w:p>
     <w:p>
@@ -725,7 +725,7 @@
     </w:p>
     <w:p>
       <w:r>
-        <w:t>4.1 Preregistered counterfactual design (not executed). A WRF-Fitch suite was specified (d01 27 km / d02 9 km Europe, YSU PBL, six deployment states S0/S50/S100/S150/S150u/S150d, four historical heatwaves, three perturbed members; ~68k core-hours, ~29 TB) but exceeds the available single-VM budget by two orders of magnitude; complete namelists and the scenario generator ship in the replication package. The observational estimates here are therefore to be read as the defensible lower bar, and the WRF suite as the planned causal closure.</w:t>
+        <w:t>4.1 Prespecified counterfactual design (not executed). A WRF-Fitch suite was specified (d01 27 km / d02 9 km Europe, YSU PBL, six deployment states S0/S50/S100/S150/S150u/S150d, four historical heatwaves, three perturbed members; ~68k core-hours, ~29 TB) but exceeds the available single-VM budget by two orders of magnitude; complete namelists and the scenario generator ship in the replication package. The observational estimates here are therefore to be read as the defensible lower bar, and the WRF suite as the planned causal closure.</w:t>
       </w:r>
     </w:p>
     <w:p>
@@ -738,7 +738,7 @@
     </w:p>
     <w:p>
       <w:r>
-        <w:t>Across 22 warm seasons of reanalysis, four complementary designs and a falsification-and-sensitivity battery (11 executed checks), large-scale European wind deployment is associated with a small, spatially heterogeneous meteorological signature on warm-season extreme temperature: positive (≈0.4–0.6×10⁻³ °C per MW upstream) on North-Sea corridors, near zero over France, negative elsewhere. Propagated to electricity demand, the pooled Wind-induced Electricity Rebound Ratio is -0.036 [-0.067,-0.006] — i.e., no detectable aggregate rebound, with localized positive values where exposure is dense and generation modest. The mechanism is consistent with a transport-mediated externality rather than a bulk energetic constraint on wind power; the estimated magnitude does not materially alter the net benefit of wind generation at the scale of current European deployment.</w:t>
+        <w:t>Across 22 warm seasons of reanalysis, four complementary designs and a falsification-and-sensitivity battery (11 executed checks), large-scale European wind deployment is associated with a small, spatially heterogeneous meteorological signature on warm-season extreme temperature: positive (≈0.4–0.6×10⁻³ °C per MW upstream) on North-Sea corridors, near zero over France, negative elsewhere. Propagated to electricity demand, the Wind-induced Electricity Rebound Ratio is 0.0009 [-0.0048,0.0098] on the country-day accounting estimand (event-level mean -0.036 [-0.067,-0.006]) — i.e., no detectable aggregate rebound, with localized positive values where exposure is dense and generation modest. The mechanism is consistent with a transport-mediated externality rather than a bulk energetic constraint on wind power; the estimated magnitude does not materially alter the net benefit of wind generation at the scale of current European deployment.</w:t>
       </w:r>
     </w:p>
     <w:p>
@@ -2137,7 +2137,7 @@
         <w:rPr>
           <w:b/>
         </w:rPr>
-        <w:t>Table 4. Per-event WERR by country (bootstrap CI over events). GB is fixed at zero by the shrinkage rule (slope fixed at 0); its [0,0] interval is a plug-in consequence, not a measured zero.</w:t>
+        <w:t>Table 4. Per-event WERR by country (bootstrap CI over events), with the country-day ratio-of-sums WERR_CD. GB is fixed at zero by the shrinkage rule (slope fixed at 0); its [0,0] interval is a plug-in consequence, not a measured zero.</w:t>
       </w:r>
     </w:p>
     <w:tbl>
@@ -2148,16 +2148,18 @@
         <w:tblLook w:firstColumn="1" w:firstRow="1" w:lastColumn="0" w:lastRow="0" w:noHBand="0" w:noVBand="1" w:val="04A0"/>
       </w:tblPr>
       <w:tblGrid>
-        <w:gridCol w:w="1728"/>
-        <w:gridCol w:w="1728"/>
-        <w:gridCol w:w="1728"/>
-        <w:gridCol w:w="1728"/>
-        <w:gridCol w:w="1728"/>
+        <w:gridCol w:w="1234"/>
+        <w:gridCol w:w="1234"/>
+        <w:gridCol w:w="1234"/>
+        <w:gridCol w:w="1234"/>
+        <w:gridCol w:w="1234"/>
+        <w:gridCol w:w="1234"/>
+        <w:gridCol w:w="1234"/>
       </w:tblGrid>
       <w:tr>
         <w:tc>
           <w:tcPr>
-            <w:tcW w:type="dxa" w:w="1728"/>
+            <w:tcW w:type="dxa" w:w="1234"/>
           </w:tcPr>
           <w:p>
             <w:r>
@@ -2167,7 +2169,7 @@
         </w:tc>
         <w:tc>
           <w:tcPr>
-            <w:tcW w:type="dxa" w:w="1728"/>
+            <w:tcW w:type="dxa" w:w="1234"/>
           </w:tcPr>
           <w:p>
             <w:r>
@@ -2177,7 +2179,7 @@
         </w:tc>
         <w:tc>
           <w:tcPr>
-            <w:tcW w:type="dxa" w:w="1728"/>
+            <w:tcW w:type="dxa" w:w="1234"/>
           </w:tcPr>
           <w:p>
             <w:r>
@@ -2187,7 +2189,7 @@
         </w:tc>
         <w:tc>
           <w:tcPr>
-            <w:tcW w:type="dxa" w:w="1728"/>
+            <w:tcW w:type="dxa" w:w="1234"/>
           </w:tcPr>
           <w:p>
             <w:r>
@@ -2197,7 +2199,7 @@
         </w:tc>
         <w:tc>
           <w:tcPr>
-            <w:tcW w:type="dxa" w:w="1728"/>
+            <w:tcW w:type="dxa" w:w="1234"/>
           </w:tcPr>
           <w:p>
             <w:r>
@@ -2205,11 +2207,31 @@
             </w:r>
           </w:p>
         </w:tc>
+        <w:tc>
+          <w:tcPr>
+            <w:tcW w:type="dxa" w:w="1234"/>
+          </w:tcPr>
+          <w:p>
+            <w:r>
+              <w:t>n c-days</w:t>
+            </w:r>
+          </w:p>
+        </w:tc>
+        <w:tc>
+          <w:tcPr>
+            <w:tcW w:type="dxa" w:w="1234"/>
+          </w:tcPr>
+          <w:p>
+            <w:r>
+              <w:t>WERR_CD</w:t>
+            </w:r>
+          </w:p>
+        </w:tc>
       </w:tr>
       <w:tr>
         <w:tc>
           <w:tcPr>
-            <w:tcW w:type="dxa" w:w="1728"/>
+            <w:tcW w:type="dxa" w:w="1234"/>
           </w:tcPr>
           <w:p>
             <w:r>
@@ -2219,7 +2241,7 @@
         </w:tc>
         <w:tc>
           <w:tcPr>
-            <w:tcW w:type="dxa" w:w="1728"/>
+            <w:tcW w:type="dxa" w:w="1234"/>
           </w:tcPr>
           <w:p>
             <w:r>
@@ -2229,7 +2251,7 @@
         </w:tc>
         <w:tc>
           <w:tcPr>
-            <w:tcW w:type="dxa" w:w="1728"/>
+            <w:tcW w:type="dxa" w:w="1234"/>
           </w:tcPr>
           <w:p>
             <w:r>
@@ -2239,7 +2261,7 @@
         </w:tc>
         <w:tc>
           <w:tcPr>
-            <w:tcW w:type="dxa" w:w="1728"/>
+            <w:tcW w:type="dxa" w:w="1234"/>
           </w:tcPr>
           <w:p>
             <w:r>
@@ -2249,7 +2271,7 @@
         </w:tc>
         <w:tc>
           <w:tcPr>
-            <w:tcW w:type="dxa" w:w="1728"/>
+            <w:tcW w:type="dxa" w:w="1234"/>
           </w:tcPr>
           <w:p>
             <w:r>
@@ -2257,11 +2279,31 @@
             </w:r>
           </w:p>
         </w:tc>
+        <w:tc>
+          <w:tcPr>
+            <w:tcW w:type="dxa" w:w="1234"/>
+          </w:tcPr>
+          <w:p>
+            <w:r>
+              <w:t>100</w:t>
+            </w:r>
+          </w:p>
+        </w:tc>
+        <w:tc>
+          <w:tcPr>
+            <w:tcW w:type="dxa" w:w="1234"/>
+          </w:tcPr>
+          <w:p>
+            <w:r>
+              <w:t>-0.005</w:t>
+            </w:r>
+          </w:p>
+        </w:tc>
       </w:tr>
       <w:tr>
         <w:tc>
           <w:tcPr>
-            <w:tcW w:type="dxa" w:w="1728"/>
+            <w:tcW w:type="dxa" w:w="1234"/>
           </w:tcPr>
           <w:p>
             <w:r>
@@ -2271,7 +2313,7 @@
         </w:tc>
         <w:tc>
           <w:tcPr>
-            <w:tcW w:type="dxa" w:w="1728"/>
+            <w:tcW w:type="dxa" w:w="1234"/>
           </w:tcPr>
           <w:p>
             <w:r>
@@ -2281,7 +2323,7 @@
         </w:tc>
         <w:tc>
           <w:tcPr>
-            <w:tcW w:type="dxa" w:w="1728"/>
+            <w:tcW w:type="dxa" w:w="1234"/>
           </w:tcPr>
           <w:p>
             <w:r>
@@ -2291,7 +2333,7 @@
         </w:tc>
         <w:tc>
           <w:tcPr>
-            <w:tcW w:type="dxa" w:w="1728"/>
+            <w:tcW w:type="dxa" w:w="1234"/>
           </w:tcPr>
           <w:p>
             <w:r>
@@ -2301,7 +2343,7 @@
         </w:tc>
         <w:tc>
           <w:tcPr>
-            <w:tcW w:type="dxa" w:w="1728"/>
+            <w:tcW w:type="dxa" w:w="1234"/>
           </w:tcPr>
           <w:p>
             <w:r>
@@ -2309,11 +2351,31 @@
             </w:r>
           </w:p>
         </w:tc>
+        <w:tc>
+          <w:tcPr>
+            <w:tcW w:type="dxa" w:w="1234"/>
+          </w:tcPr>
+          <w:p>
+            <w:r>
+              <w:t>100</w:t>
+            </w:r>
+          </w:p>
+        </w:tc>
+        <w:tc>
+          <w:tcPr>
+            <w:tcW w:type="dxa" w:w="1234"/>
+          </w:tcPr>
+          <w:p>
+            <w:r>
+              <w:t>0.042</w:t>
+            </w:r>
+          </w:p>
+        </w:tc>
       </w:tr>
       <w:tr>
         <w:tc>
           <w:tcPr>
-            <w:tcW w:type="dxa" w:w="1728"/>
+            <w:tcW w:type="dxa" w:w="1234"/>
           </w:tcPr>
           <w:p>
             <w:r>
@@ -2323,7 +2385,7 @@
         </w:tc>
         <w:tc>
           <w:tcPr>
-            <w:tcW w:type="dxa" w:w="1728"/>
+            <w:tcW w:type="dxa" w:w="1234"/>
           </w:tcPr>
           <w:p>
             <w:r>
@@ -2333,7 +2395,7 @@
         </w:tc>
         <w:tc>
           <w:tcPr>
-            <w:tcW w:type="dxa" w:w="1728"/>
+            <w:tcW w:type="dxa" w:w="1234"/>
           </w:tcPr>
           <w:p>
             <w:r>
@@ -2343,7 +2405,7 @@
         </w:tc>
         <w:tc>
           <w:tcPr>
-            <w:tcW w:type="dxa" w:w="1728"/>
+            <w:tcW w:type="dxa" w:w="1234"/>
           </w:tcPr>
           <w:p>
             <w:r>
@@ -2353,7 +2415,7 @@
         </w:tc>
         <w:tc>
           <w:tcPr>
-            <w:tcW w:type="dxa" w:w="1728"/>
+            <w:tcW w:type="dxa" w:w="1234"/>
           </w:tcPr>
           <w:p>
             <w:r>
@@ -2361,11 +2423,31 @@
             </w:r>
           </w:p>
         </w:tc>
+        <w:tc>
+          <w:tcPr>
+            <w:tcW w:type="dxa" w:w="1234"/>
+          </w:tcPr>
+          <w:p>
+            <w:r>
+              <w:t>109</w:t>
+            </w:r>
+          </w:p>
+        </w:tc>
+        <w:tc>
+          <w:tcPr>
+            <w:tcW w:type="dxa" w:w="1234"/>
+          </w:tcPr>
+          <w:p>
+            <w:r>
+              <w:t>-0.459</w:t>
+            </w:r>
+          </w:p>
+        </w:tc>
       </w:tr>
       <w:tr>
         <w:tc>
           <w:tcPr>
-            <w:tcW w:type="dxa" w:w="1728"/>
+            <w:tcW w:type="dxa" w:w="1234"/>
           </w:tcPr>
           <w:p>
             <w:r>
@@ -2375,7 +2457,7 @@
         </w:tc>
         <w:tc>
           <w:tcPr>
-            <w:tcW w:type="dxa" w:w="1728"/>
+            <w:tcW w:type="dxa" w:w="1234"/>
           </w:tcPr>
           <w:p>
             <w:r>
@@ -2385,7 +2467,7 @@
         </w:tc>
         <w:tc>
           <w:tcPr>
-            <w:tcW w:type="dxa" w:w="1728"/>
+            <w:tcW w:type="dxa" w:w="1234"/>
           </w:tcPr>
           <w:p>
             <w:r>
@@ -2395,7 +2477,7 @@
         </w:tc>
         <w:tc>
           <w:tcPr>
-            <w:tcW w:type="dxa" w:w="1728"/>
+            <w:tcW w:type="dxa" w:w="1234"/>
           </w:tcPr>
           <w:p>
             <w:r>
@@ -2405,7 +2487,7 @@
         </w:tc>
         <w:tc>
           <w:tcPr>
-            <w:tcW w:type="dxa" w:w="1728"/>
+            <w:tcW w:type="dxa" w:w="1234"/>
           </w:tcPr>
           <w:p>
             <w:r>
@@ -2413,11 +2495,31 @@
             </w:r>
           </w:p>
         </w:tc>
+        <w:tc>
+          <w:tcPr>
+            <w:tcW w:type="dxa" w:w="1234"/>
+          </w:tcPr>
+          <w:p>
+            <w:r>
+              <w:t>240</w:t>
+            </w:r>
+          </w:p>
+        </w:tc>
+        <w:tc>
+          <w:tcPr>
+            <w:tcW w:type="dxa" w:w="1234"/>
+          </w:tcPr>
+          <w:p>
+            <w:r>
+              <w:t>0.002</w:t>
+            </w:r>
+          </w:p>
+        </w:tc>
       </w:tr>
       <w:tr>
         <w:tc>
           <w:tcPr>
-            <w:tcW w:type="dxa" w:w="1728"/>
+            <w:tcW w:type="dxa" w:w="1234"/>
           </w:tcPr>
           <w:p>
             <w:r>
@@ -2427,7 +2529,7 @@
         </w:tc>
         <w:tc>
           <w:tcPr>
-            <w:tcW w:type="dxa" w:w="1728"/>
+            <w:tcW w:type="dxa" w:w="1234"/>
           </w:tcPr>
           <w:p>
             <w:r>
@@ -2437,7 +2539,7 @@
         </w:tc>
         <w:tc>
           <w:tcPr>
-            <w:tcW w:type="dxa" w:w="1728"/>
+            <w:tcW w:type="dxa" w:w="1234"/>
           </w:tcPr>
           <w:p>
             <w:r>
@@ -2447,7 +2549,7 @@
         </w:tc>
         <w:tc>
           <w:tcPr>
-            <w:tcW w:type="dxa" w:w="1728"/>
+            <w:tcW w:type="dxa" w:w="1234"/>
           </w:tcPr>
           <w:p>
             <w:r>
@@ -2457,7 +2559,7 @@
         </w:tc>
         <w:tc>
           <w:tcPr>
-            <w:tcW w:type="dxa" w:w="1728"/>
+            <w:tcW w:type="dxa" w:w="1234"/>
           </w:tcPr>
           <w:p>
             <w:r>
@@ -2465,11 +2567,31 @@
             </w:r>
           </w:p>
         </w:tc>
+        <w:tc>
+          <w:tcPr>
+            <w:tcW w:type="dxa" w:w="1234"/>
+          </w:tcPr>
+          <w:p>
+            <w:r>
+              <w:t>134</w:t>
+            </w:r>
+          </w:p>
+        </w:tc>
+        <w:tc>
+          <w:tcPr>
+            <w:tcW w:type="dxa" w:w="1234"/>
+          </w:tcPr>
+          <w:p>
+            <w:r>
+              <w:t>0.046</w:t>
+            </w:r>
+          </w:p>
+        </w:tc>
       </w:tr>
       <w:tr>
         <w:tc>
           <w:tcPr>
-            <w:tcW w:type="dxa" w:w="1728"/>
+            <w:tcW w:type="dxa" w:w="1234"/>
           </w:tcPr>
           <w:p>
             <w:r>
@@ -2479,7 +2601,7 @@
         </w:tc>
         <w:tc>
           <w:tcPr>
-            <w:tcW w:type="dxa" w:w="1728"/>
+            <w:tcW w:type="dxa" w:w="1234"/>
           </w:tcPr>
           <w:p>
             <w:r>
@@ -2489,7 +2611,7 @@
         </w:tc>
         <w:tc>
           <w:tcPr>
-            <w:tcW w:type="dxa" w:w="1728"/>
+            <w:tcW w:type="dxa" w:w="1234"/>
           </w:tcPr>
           <w:p>
             <w:r>
@@ -2499,7 +2621,7 @@
         </w:tc>
         <w:tc>
           <w:tcPr>
-            <w:tcW w:type="dxa" w:w="1728"/>
+            <w:tcW w:type="dxa" w:w="1234"/>
           </w:tcPr>
           <w:p>
             <w:r>
@@ -2509,7 +2631,7 @@
         </w:tc>
         <w:tc>
           <w:tcPr>
-            <w:tcW w:type="dxa" w:w="1728"/>
+            <w:tcW w:type="dxa" w:w="1234"/>
           </w:tcPr>
           <w:p>
             <w:r>
@@ -2517,11 +2639,31 @@
             </w:r>
           </w:p>
         </w:tc>
+        <w:tc>
+          <w:tcPr>
+            <w:tcW w:type="dxa" w:w="1234"/>
+          </w:tcPr>
+          <w:p>
+            <w:r>
+              <w:t>405</w:t>
+            </w:r>
+          </w:p>
+        </w:tc>
+        <w:tc>
+          <w:tcPr>
+            <w:tcW w:type="dxa" w:w="1234"/>
+          </w:tcPr>
+          <w:p>
+            <w:r>
+              <w:t>-0.004</w:t>
+            </w:r>
+          </w:p>
+        </w:tc>
       </w:tr>
       <w:tr>
         <w:tc>
           <w:tcPr>
-            <w:tcW w:type="dxa" w:w="1728"/>
+            <w:tcW w:type="dxa" w:w="1234"/>
           </w:tcPr>
           <w:p>
             <w:r>
@@ -2531,7 +2673,7 @@
         </w:tc>
         <w:tc>
           <w:tcPr>
-            <w:tcW w:type="dxa" w:w="1728"/>
+            <w:tcW w:type="dxa" w:w="1234"/>
           </w:tcPr>
           <w:p>
             <w:r>
@@ -2541,7 +2683,7 @@
         </w:tc>
         <w:tc>
           <w:tcPr>
-            <w:tcW w:type="dxa" w:w="1728"/>
+            <w:tcW w:type="dxa" w:w="1234"/>
           </w:tcPr>
           <w:p>
             <w:r>
@@ -2551,7 +2693,7 @@
         </w:tc>
         <w:tc>
           <w:tcPr>
-            <w:tcW w:type="dxa" w:w="1728"/>
+            <w:tcW w:type="dxa" w:w="1234"/>
           </w:tcPr>
           <w:p>
             <w:r>
@@ -2561,7 +2703,7 @@
         </w:tc>
         <w:tc>
           <w:tcPr>
-            <w:tcW w:type="dxa" w:w="1728"/>
+            <w:tcW w:type="dxa" w:w="1234"/>
           </w:tcPr>
           <w:p>
             <w:r>
@@ -2569,11 +2711,31 @@
             </w:r>
           </w:p>
         </w:tc>
+        <w:tc>
+          <w:tcPr>
+            <w:tcW w:type="dxa" w:w="1234"/>
+          </w:tcPr>
+          <w:p>
+            <w:r>
+              <w:t>353</w:t>
+            </w:r>
+          </w:p>
+        </w:tc>
+        <w:tc>
+          <w:tcPr>
+            <w:tcW w:type="dxa" w:w="1234"/>
+          </w:tcPr>
+          <w:p>
+            <w:r>
+              <w:t>-0.000</w:t>
+            </w:r>
+          </w:p>
+        </w:tc>
       </w:tr>
       <w:tr>
         <w:tc>
           <w:tcPr>
-            <w:tcW w:type="dxa" w:w="1728"/>
+            <w:tcW w:type="dxa" w:w="1234"/>
           </w:tcPr>
           <w:p>
             <w:r>
@@ -2583,7 +2745,7 @@
         </w:tc>
         <w:tc>
           <w:tcPr>
-            <w:tcW w:type="dxa" w:w="1728"/>
+            <w:tcW w:type="dxa" w:w="1234"/>
           </w:tcPr>
           <w:p>
             <w:r>
@@ -2593,7 +2755,7 @@
         </w:tc>
         <w:tc>
           <w:tcPr>
-            <w:tcW w:type="dxa" w:w="1728"/>
+            <w:tcW w:type="dxa" w:w="1234"/>
           </w:tcPr>
           <w:p>
             <w:r>
@@ -2603,7 +2765,7 @@
         </w:tc>
         <w:tc>
           <w:tcPr>
-            <w:tcW w:type="dxa" w:w="1728"/>
+            <w:tcW w:type="dxa" w:w="1234"/>
           </w:tcPr>
           <w:p>
             <w:r>
@@ -2613,7 +2775,7 @@
         </w:tc>
         <w:tc>
           <w:tcPr>
-            <w:tcW w:type="dxa" w:w="1728"/>
+            <w:tcW w:type="dxa" w:w="1234"/>
           </w:tcPr>
           <w:p>
             <w:r>
@@ -2621,11 +2783,31 @@
             </w:r>
           </w:p>
         </w:tc>
+        <w:tc>
+          <w:tcPr>
+            <w:tcW w:type="dxa" w:w="1234"/>
+          </w:tcPr>
+          <w:p>
+            <w:r>
+              <w:t>272</w:t>
+            </w:r>
+          </w:p>
+        </w:tc>
+        <w:tc>
+          <w:tcPr>
+            <w:tcW w:type="dxa" w:w="1234"/>
+          </w:tcPr>
+          <w:p>
+            <w:r>
+              <w:t>0.000</w:t>
+            </w:r>
+          </w:p>
+        </w:tc>
       </w:tr>
       <w:tr>
         <w:tc>
           <w:tcPr>
-            <w:tcW w:type="dxa" w:w="1728"/>
+            <w:tcW w:type="dxa" w:w="1234"/>
           </w:tcPr>
           <w:p>
             <w:r>
@@ -2635,7 +2817,7 @@
         </w:tc>
         <w:tc>
           <w:tcPr>
-            <w:tcW w:type="dxa" w:w="1728"/>
+            <w:tcW w:type="dxa" w:w="1234"/>
           </w:tcPr>
           <w:p>
             <w:r>
@@ -2645,7 +2827,7 @@
         </w:tc>
         <w:tc>
           <w:tcPr>
-            <w:tcW w:type="dxa" w:w="1728"/>
+            <w:tcW w:type="dxa" w:w="1234"/>
           </w:tcPr>
           <w:p>
             <w:r>
@@ -2655,7 +2837,7 @@
         </w:tc>
         <w:tc>
           <w:tcPr>
-            <w:tcW w:type="dxa" w:w="1728"/>
+            <w:tcW w:type="dxa" w:w="1234"/>
           </w:tcPr>
           <w:p>
             <w:r>
@@ -2665,7 +2847,7 @@
         </w:tc>
         <w:tc>
           <w:tcPr>
-            <w:tcW w:type="dxa" w:w="1728"/>
+            <w:tcW w:type="dxa" w:w="1234"/>
           </w:tcPr>
           <w:p>
             <w:r>
@@ -2673,11 +2855,31 @@
             </w:r>
           </w:p>
         </w:tc>
+        <w:tc>
+          <w:tcPr>
+            <w:tcW w:type="dxa" w:w="1234"/>
+          </w:tcPr>
+          <w:p>
+            <w:r>
+              <w:t>117</w:t>
+            </w:r>
+          </w:p>
+        </w:tc>
+        <w:tc>
+          <w:tcPr>
+            <w:tcW w:type="dxa" w:w="1234"/>
+          </w:tcPr>
+          <w:p>
+            <w:r>
+              <w:t>0.106</w:t>
+            </w:r>
+          </w:p>
+        </w:tc>
       </w:tr>
       <w:tr>
         <w:tc>
           <w:tcPr>
-            <w:tcW w:type="dxa" w:w="1728"/>
+            <w:tcW w:type="dxa" w:w="1234"/>
           </w:tcPr>
           <w:p>
             <w:r>
@@ -2687,7 +2889,7 @@
         </w:tc>
         <w:tc>
           <w:tcPr>
-            <w:tcW w:type="dxa" w:w="1728"/>
+            <w:tcW w:type="dxa" w:w="1234"/>
           </w:tcPr>
           <w:p>
             <w:r>
@@ -2697,7 +2899,7 @@
         </w:tc>
         <w:tc>
           <w:tcPr>
-            <w:tcW w:type="dxa" w:w="1728"/>
+            <w:tcW w:type="dxa" w:w="1234"/>
           </w:tcPr>
           <w:p>
             <w:r>
@@ -2707,7 +2909,7 @@
         </w:tc>
         <w:tc>
           <w:tcPr>
-            <w:tcW w:type="dxa" w:w="1728"/>
+            <w:tcW w:type="dxa" w:w="1234"/>
           </w:tcPr>
           <w:p>
             <w:r>
@@ -2717,7 +2919,7 @@
         </w:tc>
         <w:tc>
           <w:tcPr>
-            <w:tcW w:type="dxa" w:w="1728"/>
+            <w:tcW w:type="dxa" w:w="1234"/>
           </w:tcPr>
           <w:p>
             <w:r>
@@ -2725,11 +2927,31 @@
             </w:r>
           </w:p>
         </w:tc>
+        <w:tc>
+          <w:tcPr>
+            <w:tcW w:type="dxa" w:w="1234"/>
+          </w:tcPr>
+          <w:p>
+            <w:r>
+              <w:t>231</w:t>
+            </w:r>
+          </w:p>
+        </w:tc>
+        <w:tc>
+          <w:tcPr>
+            <w:tcW w:type="dxa" w:w="1234"/>
+          </w:tcPr>
+          <w:p>
+            <w:r>
+              <w:t>-0.004</w:t>
+            </w:r>
+          </w:p>
+        </w:tc>
       </w:tr>
       <w:tr>
         <w:tc>
           <w:tcPr>
-            <w:tcW w:type="dxa" w:w="1728"/>
+            <w:tcW w:type="dxa" w:w="1234"/>
           </w:tcPr>
           <w:p>
             <w:r>
@@ -2739,7 +2961,7 @@
         </w:tc>
         <w:tc>
           <w:tcPr>
-            <w:tcW w:type="dxa" w:w="1728"/>
+            <w:tcW w:type="dxa" w:w="1234"/>
           </w:tcPr>
           <w:p>
             <w:r>
@@ -2749,7 +2971,7 @@
         </w:tc>
         <w:tc>
           <w:tcPr>
-            <w:tcW w:type="dxa" w:w="1728"/>
+            <w:tcW w:type="dxa" w:w="1234"/>
           </w:tcPr>
           <w:p>
             <w:r>
@@ -2759,7 +2981,7 @@
         </w:tc>
         <w:tc>
           <w:tcPr>
-            <w:tcW w:type="dxa" w:w="1728"/>
+            <w:tcW w:type="dxa" w:w="1234"/>
           </w:tcPr>
           <w:p>
             <w:r>
@@ -2769,7 +2991,7 @@
         </w:tc>
         <w:tc>
           <w:tcPr>
-            <w:tcW w:type="dxa" w:w="1728"/>
+            <w:tcW w:type="dxa" w:w="1234"/>
           </w:tcPr>
           <w:p>
             <w:r>
@@ -2777,11 +2999,31 @@
             </w:r>
           </w:p>
         </w:tc>
+        <w:tc>
+          <w:tcPr>
+            <w:tcW w:type="dxa" w:w="1234"/>
+          </w:tcPr>
+          <w:p>
+            <w:r>
+              <w:t>107</w:t>
+            </w:r>
+          </w:p>
+        </w:tc>
+        <w:tc>
+          <w:tcPr>
+            <w:tcW w:type="dxa" w:w="1234"/>
+          </w:tcPr>
+          <w:p>
+            <w:r>
+              <w:t>0.073</w:t>
+            </w:r>
+          </w:p>
+        </w:tc>
       </w:tr>
       <w:tr>
         <w:tc>
           <w:tcPr>
-            <w:tcW w:type="dxa" w:w="1728"/>
+            <w:tcW w:type="dxa" w:w="1234"/>
           </w:tcPr>
           <w:p>
             <w:r>
@@ -2791,7 +3033,7 @@
         </w:tc>
         <w:tc>
           <w:tcPr>
-            <w:tcW w:type="dxa" w:w="1728"/>
+            <w:tcW w:type="dxa" w:w="1234"/>
           </w:tcPr>
           <w:p>
             <w:r>
@@ -2801,7 +3043,7 @@
         </w:tc>
         <w:tc>
           <w:tcPr>
-            <w:tcW w:type="dxa" w:w="1728"/>
+            <w:tcW w:type="dxa" w:w="1234"/>
           </w:tcPr>
           <w:p>
             <w:r>
@@ -2811,7 +3053,7 @@
         </w:tc>
         <w:tc>
           <w:tcPr>
-            <w:tcW w:type="dxa" w:w="1728"/>
+            <w:tcW w:type="dxa" w:w="1234"/>
           </w:tcPr>
           <w:p>
             <w:r>
@@ -2821,7 +3063,7 @@
         </w:tc>
         <w:tc>
           <w:tcPr>
-            <w:tcW w:type="dxa" w:w="1728"/>
+            <w:tcW w:type="dxa" w:w="1234"/>
           </w:tcPr>
           <w:p>
             <w:r>
@@ -2829,11 +3071,31 @@
             </w:r>
           </w:p>
         </w:tc>
+        <w:tc>
+          <w:tcPr>
+            <w:tcW w:type="dxa" w:w="1234"/>
+          </w:tcPr>
+          <w:p>
+            <w:r>
+              <w:t>179</w:t>
+            </w:r>
+          </w:p>
+        </w:tc>
+        <w:tc>
+          <w:tcPr>
+            <w:tcW w:type="dxa" w:w="1234"/>
+          </w:tcPr>
+          <w:p>
+            <w:r>
+              <w:t>-0.041</w:t>
+            </w:r>
+          </w:p>
+        </w:tc>
       </w:tr>
       <w:tr>
         <w:tc>
           <w:tcPr>
-            <w:tcW w:type="dxa" w:w="1728"/>
+            <w:tcW w:type="dxa" w:w="1234"/>
           </w:tcPr>
           <w:p>
             <w:r>
@@ -2843,7 +3105,7 @@
         </w:tc>
         <w:tc>
           <w:tcPr>
-            <w:tcW w:type="dxa" w:w="1728"/>
+            <w:tcW w:type="dxa" w:w="1234"/>
           </w:tcPr>
           <w:p>
             <w:r>
@@ -2853,7 +3115,7 @@
         </w:tc>
         <w:tc>
           <w:tcPr>
-            <w:tcW w:type="dxa" w:w="1728"/>
+            <w:tcW w:type="dxa" w:w="1234"/>
           </w:tcPr>
           <w:p>
             <w:r>
@@ -2863,7 +3125,7 @@
         </w:tc>
         <w:tc>
           <w:tcPr>
-            <w:tcW w:type="dxa" w:w="1728"/>
+            <w:tcW w:type="dxa" w:w="1234"/>
           </w:tcPr>
           <w:p>
             <w:r>
@@ -2873,7 +3135,7 @@
         </w:tc>
         <w:tc>
           <w:tcPr>
-            <w:tcW w:type="dxa" w:w="1728"/>
+            <w:tcW w:type="dxa" w:w="1234"/>
           </w:tcPr>
           <w:p>
             <w:r>
@@ -2881,11 +3143,31 @@
             </w:r>
           </w:p>
         </w:tc>
+        <w:tc>
+          <w:tcPr>
+            <w:tcW w:type="dxa" w:w="1234"/>
+          </w:tcPr>
+          <w:p>
+            <w:r>
+              <w:t>15</w:t>
+            </w:r>
+          </w:p>
+        </w:tc>
+        <w:tc>
+          <w:tcPr>
+            <w:tcW w:type="dxa" w:w="1234"/>
+          </w:tcPr>
+          <w:p>
+            <w:r>
+              <w:t>-0.014</w:t>
+            </w:r>
+          </w:p>
+        </w:tc>
       </w:tr>
       <w:tr>
         <w:tc>
           <w:tcPr>
-            <w:tcW w:type="dxa" w:w="1728"/>
+            <w:tcW w:type="dxa" w:w="1234"/>
           </w:tcPr>
           <w:p>
             <w:r>
@@ -2895,7 +3177,7 @@
         </w:tc>
         <w:tc>
           <w:tcPr>
-            <w:tcW w:type="dxa" w:w="1728"/>
+            <w:tcW w:type="dxa" w:w="1234"/>
           </w:tcPr>
           <w:p>
             <w:r>
@@ -2905,7 +3187,7 @@
         </w:tc>
         <w:tc>
           <w:tcPr>
-            <w:tcW w:type="dxa" w:w="1728"/>
+            <w:tcW w:type="dxa" w:w="1234"/>
           </w:tcPr>
           <w:p>
             <w:r>
@@ -2915,7 +3197,7 @@
         </w:tc>
         <w:tc>
           <w:tcPr>
-            <w:tcW w:type="dxa" w:w="1728"/>
+            <w:tcW w:type="dxa" w:w="1234"/>
           </w:tcPr>
           <w:p>
             <w:r>
@@ -2925,11 +3207,31 @@
         </w:tc>
         <w:tc>
           <w:tcPr>
-            <w:tcW w:type="dxa" w:w="1728"/>
+            <w:tcW w:type="dxa" w:w="1234"/>
           </w:tcPr>
           <w:p>
             <w:r>
               <w:t>[-0.067,-0.006]</w:t>
+            </w:r>
+          </w:p>
+        </w:tc>
+        <w:tc>
+          <w:tcPr>
+            <w:tcW w:type="dxa" w:w="1234"/>
+          </w:tcPr>
+          <w:p>
+            <w:r>
+              <w:t>2362</w:t>
+            </w:r>
+          </w:p>
+        </w:tc>
+        <w:tc>
+          <w:tcPr>
+            <w:tcW w:type="dxa" w:w="1234"/>
+          </w:tcPr>
+          <w:p>
+            <w:r>
+              <w:t>0.001</w:t>
             </w:r>
           </w:p>
         </w:tc>
@@ -3329,7 +3631,7 @@
           <w:i/>
           <w:sz w:val="18"/>
         </w:rPr>
-        <w:t>Figure 8. Signed WERR per country with 95% bootstrap CI; dashed = pooled estimate.</w:t>
+        <w:t>Figure 8. Signed WERR per country with 95% bootstrap CI; dashed = pooled event-mean estimate. The country-day ratio-of-sums estimand WERR_CD is reported in Table 4 and §3.7.</w:t>
       </w:r>
     </w:p>
     <w:p>

</xml_diff>

<commit_message>
Final independent audit: fix unproven 'upper bound' wording, Table 3 forward-cite, cover-letter phrasing; add Gates A-F audit docs; regenerate zips
Co-Authored-By: Tatsuki Onishi <bougtoir@gmail.com>
</commit_message>
<xml_diff>
--- a/manuscript/manuscript.docx
+++ b/manuscript/manuscript.docx
@@ -534,7 +534,7 @@
         <w:t>29</w:t>
       </w:r>
       <w:r>
-        <w:t>. For each country we estimate the deseasonalized sensitivity of residual daily load to cooling-degree-days above 22 °C on 2015–2018 and validate on 2019–2020 (Table 3), consistent with documented European heat-demand dynamics</w:t>
+        <w:t>. For each country we estimate the deseasonalized sensitivity of residual daily load to cooling-degree-days above 22 °C on 2015–2018 and validate on 2019–2020 (model reported in §3.5), consistent with documented European heat-demand dynamics</w:t>
       </w:r>
       <w:r>
         <w:rPr>
@@ -543,7 +543,7 @@
         <w:t>30</w:t>
       </w:r>
       <w:r>
-        <w:t>. The slope is a local marginal temperature sensitivity, estimated on deseasonalized residuals; out-of-sample R² is low or negative for many countries (Table 3), so we propagate coefficient uncertainty rather than claim predictive skill. Slope standard errors use a month-block bootstrap (B=500, months resampled with replacement within the training years). Instability is flagged when the slope changes sign across blocked-CV folds or |slope|/SE&lt;1; unstable slopes are shrunk via a normal–normal empirical-Bayes step toward the inverse-variance pooled mean (μ≈27 MW/°C, between-country τ²≈9.5×10³): posterior mean = (w·x + μ/τ²)/(w + 1/τ²) with w = 1/SE². The rule uses only training-period slope properties — never the WERR sign or magnitude — and affects GB (fixed at 0) plus DK, AT, NO, FI and CH. For each primary heatwave event we compute the association-implied temperature change ΔT = β_region·WFI, translate it to energy with the demand slope and event duration, and divide by the event's actual wind generation: WERR = ΔE_heat/E_wind. Uncertainty is bootstrapped over events, with Monte-Carlo draws of the atmospheric and demand coefficients inside each replicate (B=1000). Because pixel-level events share whole-country denominators (3,017 events reuse only ≈3.2k unique country-days, mean multiplicity 5.4), we also define a country-day estimand: each country's actual wind generation enters at most once per day, and the demand response is applied once per country-day, weighted by the fraction of the country's event pixels under an active event; WERR_CD is the ratio of summed implied demand to summed generation, with uncertainty from a two-way (country × year) block bootstrap plus delta-method propagation of coefficient standard errors.</w:t>
+        <w:t>. The slope is a local marginal temperature sensitivity, estimated on deseasonalized residuals; out-of-sample R² is low or negative for many countries (§3.5), so we propagate coefficient uncertainty rather than claim predictive skill. Slope standard errors use a month-block bootstrap (B=500, months resampled with replacement within the training years). Instability is flagged when the slope changes sign across blocked-CV folds or |slope|/SE&lt;1; unstable slopes are shrunk via a normal–normal empirical-Bayes step toward the inverse-variance pooled mean (μ≈27 MW/°C, between-country τ²≈9.5×10³): posterior mean = (w·x + μ/τ²)/(w + 1/τ²) with w = 1/SE². The rule uses only training-period slope properties — never the WERR sign or magnitude — and affects GB (fixed at 0) plus DK, AT, NO, FI and CH. For each primary heatwave event we compute the association-implied temperature change ΔT = β_region·WFI, translate it to energy with the demand slope and event duration, and divide by the event's actual wind generation: WERR = ΔE_heat/E_wind. Uncertainty is bootstrapped over events, with Monte-Carlo draws of the atmospheric and demand coefficients inside each replicate (B=1000). Because pixel-level events share whole-country denominators (3,017 events reuse only ≈3.2k unique country-days, mean multiplicity 5.4), we also define a country-day estimand: each country's actual wind generation enters at most once per day, and the demand response is applied once per country-day, weighted by the fraction of the country's event pixels under an active event; WERR_CD is the ratio of summed implied demand to summed generation, with uncertainty from a two-way (country × year) block bootstrap plus delta-method propagation of coefficient standard errors.</w:t>
       </w:r>
     </w:p>
     <w:p>
@@ -600,7 +600,7 @@
     </w:p>
     <w:p>
       <w:r>
-        <w:t>Numerically, event-mean exposure implies regional ΔT medians of +1.8 °C (North-Sea–Denmark/Germany), +2.0 °C (UK-offshore), +1.4 °C (Low Countries), -0.6 °C (Iberia), -1.9 °C (domain) and ≈0 °C for France — i.e. implied anomalies of order 1–2 °C in either sign on the high-exposure corridors rather than a uniformly small effect. These are β×WFI scenario magnitudes — the linear response implied by D1 under sustained exposure — not observed turbine-attributable warming; they are upper bounds on the association-implied perturbation and must not be read as measured causal ΔT. The sign pattern (positive where exposure is dense and maritime, null-to-negative elsewhere) survives the BH-FDR correction in 5 of 6 regional tests.</w:t>
+        <w:t>Numerically, event-mean exposure implies regional ΔT medians of +1.8 °C (North-Sea–Denmark/Germany), +2.0 °C (UK-offshore), +1.4 °C (Low Countries), -0.6 °C (Iberia), -1.9 °C (domain) and ≈0 °C for France — i.e. implied anomalies of order 1–2 °C in either sign on the high-exposure corridors rather than a uniformly small effect. These are β×WFI scenario magnitudes — the linear response implied by D1 under sustained exposure — not observed turbine-attributable warming and are not bounds either (no bounding argument is made); they must not be read as measured causal ΔT. The sign pattern (positive where exposure is dense and maritime, null-to-negative elsewhere) survives the BH-FDR correction in 5 of 6 regional tests.</w:t>
       </w:r>
     </w:p>
     <w:p>
@@ -613,7 +613,7 @@
     </w:p>
     <w:p>
       <w:r>
-        <w:t>Under circulation matching (|SMD| ≲ 0.27 on all covariates, Fig. 5), high-WFI days are warmer than matched low-WFI days by 0.40 °C (France, p=0.000), 0.36 °C (Iberia, p=0.000) and 0.08 °C (domain, p=0.000); North-Sea corridors are near zero. The analog estimates are larger in absolute terms than the panel slope but likewise heterogeneous — we read them as an upper bound under imperfect balance.</w:t>
+        <w:t>Under circulation matching (|SMD| ≲ 0.27 on all covariates, Fig. 5), high-WFI days are warmer than matched low-WFI days by 0.40 °C (France, p=0.000), 0.36 °C (Iberia, p=0.000) and 0.08 °C (domain, p=0.000); North-Sea corridors are near zero. The analog estimates are larger in absolute terms than the panel slope but likewise heterogeneous — we read them as raw matched contrasts — with imperfect balance they are neither bounds nor causal effects.</w:t>
       </w:r>
     </w:p>
     <w:p>

</xml_diff>

<commit_message>
Document-integrity gate: OMML equations, Fig.-style captions, Fig.S1 orphan fix, panel notation, integrity tests, audit docs, DOCUMENT_LOCK zips
Co-Authored-By: Tatsuki Onishi <bougtoir@gmail.com>
</commit_message>
<xml_diff>
--- a/manuscript/manuscript.docx
+++ b/manuscript/manuscript.docx
@@ -411,7 +411,7 @@
     </w:p>
     <w:p>
       <w:r>
-        <w:t>Five fixed transects (Table 1, Fig. 1a) cross the major upstream corridors — North Sea to the Low Countries and to Denmark/Germany, Atlantic to France and to Iberia, and UK offshore to the continent — and the daily cross-transect moisture flux F(t) is the along-line integral of Q·n. Divergence is evaluated with centred differences on the sphere; transect fluxes use grid centres within half a cell of each segment weighted by path length. Pressure-level products are built on the store's native 1.5° grid; the single-level store (N320 Gaussian) is remapped by nearest neighbour, a choice whose interpolation error is negligible at this resolution.</w:t>
+        <w:t>Five fixed transects (Table 1, Fig. 1(a)) cross the major upstream corridors — North Sea to the Low Countries and to Denmark/Germany, Atlantic to France and to Iberia, and UK offshore to the continent — and the daily cross-transect moisture flux F(t) is the along-line integral of Q·n. Divergence is evaluated with centred differences on the sphere; transect fluxes use grid centres within half a cell of each segment weighted by path length. Pressure-level products are built on the store's native 1.5° grid; the single-level store (N320 Gaussian) is remapped by nearest neighbour, a choice whose interpolation error is negligible at this resolution.</w:t>
       </w:r>
     </w:p>
     <w:p>
@@ -429,7 +429,7 @@
     </w:p>
     <w:p>
       <w:r>
-        <w:t>A unified register of 140,010 turbines was assembled from four sources: the eww offshore database, the Danish Stamdataregisteret (UTM32→WGS84), the German Marktstammdatenregister (MaStR), and OpenStreetMap power=generator features extracted from per-country Geofabrik PBF snapshots. Registers take precedence within 150 m; OSM self-duplicates within 50 m were dropped, leaving 83,575 OSM units. Where rated capacity is missing it is imputed by country median. Undated OSM units (97% of OSM) enter a time-invariant background density, while dated units (registers + dated OSM) drive the time-varying capacity field (Fig. 1a). This design inflates early-period exposure and is therefore conservative against positive trends.</w:t>
+        <w:t>A unified register of 140,010 turbines was assembled from four sources: the eww offshore database, the Danish Stamdataregisteret (UTM32→WGS84), the German Marktstammdatenregister (MaStR), and OpenStreetMap power=generator features extracted from per-country Geofabrik PBF snapshots. Registers take precedence within 150 m; OSM self-duplicates within 50 m were dropped, leaving 83,575 OSM units. Where rated capacity is missing it is imputed by country median. Undated OSM units (97% of OSM) enter a time-invariant background density, while dated units (registers + dated OSM) drive the time-varying capacity field (Fig. 1(a)). This design inflates early-period exposure and is therefore conservative against positive trends.</w:t>
       </w:r>
     </w:p>
     <w:p>
@@ -442,7 +442,234 @@
     </w:p>
     <w:p>
       <w:r>
-        <w:t>For each 1.5° cell and day we compute an upstream-capacity exposure (WFI): the cumulative deployed capacity sampled at six 50-km steps along the day's upwind direction (negative of the daily mean 10-m wind vector), exponentially weighted with a 100-km e-folding scale (Fig. S1). The upstream construction yields the downwind-interception weighting without an O(turbines×pixels×days) product; alternative kernels (50 km, 200 km, unweighted) are used for falsification.</w:t>
+        <w:t>For each 1.5° cell and day we compute an upstream-capacity exposure (WFI): the cumulative deployed capacity sampled at six 50-km steps along the day's upwind direction (negative of the daily mean 10-m wind vector), exponentially weighted with a 100-km e-folding scale used for falsification). The upstream construction yields the downwind-interception weighting without an O(turbines×pixels×days) product:</w:t>
+      </w:r>
+    </w:p>
+    <w:p>
+      <m:oMathPara>
+        <m:oMathParaPr>
+          <m:jc m:val="center"/>
+        </m:oMathParaPr>
+        <m:oMath>
+          <m:r>
+            <m:rPr>
+              <m:sty m:val="p"/>
+            </m:rPr>
+            <w:rPr>
+              <w:rFonts w:ascii="Cambria Math" w:hAnsi="Cambria Math"/>
+            </w:rPr>
+            <m:t xml:space="preserve">WFI</m:t>
+          </m:r>
+          <m:r>
+            <m:rPr/>
+            <w:rPr>
+              <w:rFonts w:ascii="Cambria Math" w:hAnsi="Cambria Math"/>
+            </w:rPr>
+            <m:t xml:space="preserve">(</m:t>
+          </m:r>
+          <m:r>
+            <m:rPr>
+              <m:sty m:val="p"/>
+            </m:rPr>
+            <w:rPr>
+              <w:rFonts w:ascii="Cambria Math" w:hAnsi="Cambria Math"/>
+            </w:rPr>
+            <m:t xml:space="preserve">c</m:t>
+          </m:r>
+          <m:r>
+            <m:rPr/>
+            <w:rPr>
+              <w:rFonts w:ascii="Cambria Math" w:hAnsi="Cambria Math"/>
+            </w:rPr>
+            <m:t xml:space="preserve">,</m:t>
+          </m:r>
+          <m:r>
+            <m:rPr>
+              <m:sty m:val="p"/>
+            </m:rPr>
+            <w:rPr>
+              <w:rFonts w:ascii="Cambria Math" w:hAnsi="Cambria Math"/>
+            </w:rPr>
+            <m:t xml:space="preserve">d</m:t>
+          </m:r>
+          <m:r>
+            <m:rPr/>
+            <w:rPr>
+              <w:rFonts w:ascii="Cambria Math" w:hAnsi="Cambria Math"/>
+            </w:rPr>
+            <m:t xml:space="preserve">)</m:t>
+          </m:r>
+          <m:r>
+            <m:rPr/>
+            <w:rPr>
+              <w:rFonts w:ascii="Cambria Math" w:hAnsi="Cambria Math"/>
+            </w:rPr>
+            <m:t xml:space="preserve"> = </m:t>
+          </m:r>
+          <m:nary>
+            <m:naryPr>
+              <m:chr m:val="∑"/>
+              <m:limLoc m:val="undOvr"/>
+              <m:subHide m:val="0"/>
+              <m:supHide m:val="1"/>
+            </m:naryPr>
+            <m:sub>
+              <m:r>
+                <m:rPr/>
+                <w:rPr>
+                  <w:rFonts w:ascii="Cambria Math" w:hAnsi="Cambria Math"/>
+                </w:rPr>
+                <m:t xml:space="preserve">k=1</m:t>
+              </m:r>
+            </m:sub>
+            <m:sup/>
+            <m:e>
+              <m:r>
+                <m:rPr/>
+                <w:rPr>
+                  <w:rFonts w:ascii="Cambria Math" w:hAnsi="Cambria Math"/>
+                </w:rPr>
+                <m:t xml:space="preserve">exp</m:t>
+              </m:r>
+              <m:r>
+                <m:rPr/>
+                <w:rPr>
+                  <w:rFonts w:ascii="Cambria Math" w:hAnsi="Cambria Math"/>
+                </w:rPr>
+                <m:t xml:space="preserve">(−</m:t>
+              </m:r>
+              <m:f>
+                <m:num>
+                  <m:r>
+                    <m:rPr/>
+                    <w:rPr>
+                      <w:rFonts w:ascii="Cambria Math" w:hAnsi="Cambria Math"/>
+                    </w:rPr>
+                    <m:t xml:space="preserve">50k</m:t>
+                  </m:r>
+                </m:num>
+                <m:den>
+                  <m:r>
+                    <m:rPr/>
+                    <w:rPr>
+                      <w:rFonts w:ascii="Cambria Math" w:hAnsi="Cambria Math"/>
+                    </w:rPr>
+                    <m:t xml:space="preserve">100</m:t>
+                  </m:r>
+                </m:den>
+              </m:f>
+              <m:r>
+                <m:rPr/>
+                <w:rPr>
+                  <w:rFonts w:ascii="Cambria Math" w:hAnsi="Cambria Math"/>
+                </w:rPr>
+                <m:t xml:space="preserve">)</m:t>
+              </m:r>
+              <m:r>
+                <m:rPr/>
+                <w:rPr>
+                  <w:rFonts w:ascii="Cambria Math" w:hAnsi="Cambria Math"/>
+                </w:rPr>
+                <m:t xml:space="preserve">·</m:t>
+              </m:r>
+              <m:sSub>
+                <m:e>
+                  <m:r>
+                    <m:rPr>
+                      <m:sty m:val="p"/>
+                    </m:rPr>
+                    <w:rPr>
+                      <w:rFonts w:ascii="Cambria Math" w:hAnsi="Cambria Math"/>
+                    </w:rPr>
+                    <m:t xml:space="preserve">cap</m:t>
+                  </m:r>
+                </m:e>
+                <m:sub>
+                  <m:r>
+                    <m:rPr/>
+                    <w:rPr>
+                      <w:rFonts w:ascii="Cambria Math" w:hAnsi="Cambria Math"/>
+                    </w:rPr>
+                    <m:t xml:space="preserve">d</m:t>
+                  </m:r>
+                </m:sub>
+              </m:sSub>
+              <m:r>
+                <m:rPr/>
+                <w:rPr>
+                  <w:rFonts w:ascii="Cambria Math" w:hAnsi="Cambria Math"/>
+                </w:rPr>
+                <m:t xml:space="preserve">(</m:t>
+              </m:r>
+              <m:sSub>
+                <m:e>
+                  <m:r>
+                    <m:rPr>
+                      <m:sty m:val="p"/>
+                    </m:rPr>
+                    <w:rPr>
+                      <w:rFonts w:ascii="Cambria Math" w:hAnsi="Cambria Math"/>
+                    </w:rPr>
+                    <m:t xml:space="preserve">u</m:t>
+                  </m:r>
+                </m:e>
+                <m:sub>
+                  <m:r>
+                    <m:rPr/>
+                    <w:rPr>
+                      <w:rFonts w:ascii="Cambria Math" w:hAnsi="Cambria Math"/>
+                    </w:rPr>
+                    <m:t xml:space="preserve">k</m:t>
+                  </m:r>
+                </m:sub>
+              </m:sSub>
+              <m:r>
+                <m:rPr/>
+                <w:rPr>
+                  <w:rFonts w:ascii="Cambria Math" w:hAnsi="Cambria Math"/>
+                </w:rPr>
+                <m:t xml:space="preserve">(</m:t>
+              </m:r>
+              <m:r>
+                <m:rPr>
+                  <m:sty m:val="p"/>
+                </m:rPr>
+                <w:rPr>
+                  <w:rFonts w:ascii="Cambria Math" w:hAnsi="Cambria Math"/>
+                </w:rPr>
+                <m:t xml:space="preserve">c</m:t>
+              </m:r>
+              <m:r>
+                <m:rPr/>
+                <w:rPr>
+                  <w:rFonts w:ascii="Cambria Math" w:hAnsi="Cambria Math"/>
+                </w:rPr>
+                <m:t xml:space="preserve">,</m:t>
+              </m:r>
+              <m:r>
+                <m:rPr>
+                  <m:sty m:val="p"/>
+                </m:rPr>
+                <w:rPr>
+                  <w:rFonts w:ascii="Cambria Math" w:hAnsi="Cambria Math"/>
+                </w:rPr>
+                <m:t xml:space="preserve">d</m:t>
+              </m:r>
+              <m:r>
+                <m:rPr/>
+                <w:rPr>
+                  <w:rFonts w:ascii="Cambria Math" w:hAnsi="Cambria Math"/>
+                </w:rPr>
+                <m:t xml:space="preserve">))</m:t>
+              </m:r>
+            </m:e>
+          </m:nary>
+        </m:oMath>
+      </m:oMathPara>
+    </w:p>
+    <w:p>
+      <w:r>
+        <w:t>where u_k(c, d) is the k-th 50-km upwind sample along the day's mean 10-m wind vector and cap_d(·) is that day's deployed capacity in MW; the 100-km e-folding scale caps the effective footprint at six steps. Alternative kernels (50 km, 200 km, unweighted) enter the falsification battery.</w:t>
       </w:r>
     </w:p>
     <w:p>
@@ -543,7 +770,242 @@
         <w:t>30</w:t>
       </w:r>
       <w:r>
-        <w:t>. The slope is a local marginal temperature sensitivity, estimated on deseasonalized residuals; out-of-sample R² is low or negative for many countries (§3.5), so we propagate coefficient uncertainty rather than claim predictive skill. Slope standard errors use a month-block bootstrap (B=500, months resampled with replacement within the training years). Instability is flagged when the slope changes sign across blocked-CV folds or |slope|/SE&lt;1; unstable slopes are shrunk via a normal–normal empirical-Bayes step toward the inverse-variance pooled mean (μ≈27 MW/°C, between-country τ²≈9.5×10³): posterior mean = (w·x + μ/τ²)/(w + 1/τ²) with w = 1/SE². The rule uses only training-period slope properties — never the WERR sign or magnitude — and affects GB (fixed at 0) plus DK, AT, NO, FI and CH. For each primary heatwave event we compute the association-implied temperature change ΔT = β_region·WFI, translate it to energy with the demand slope and event duration, and divide by the event's actual wind generation: WERR = ΔE_heat/E_wind. Uncertainty is bootstrapped over events, with Monte-Carlo draws of the atmospheric and demand coefficients inside each replicate (B=1000). Because pixel-level events share whole-country denominators (3,017 events reuse only ≈3.2k unique country-days, mean multiplicity 5.4), we also define a country-day estimand: each country's actual wind generation enters at most once per day, and the demand response is applied once per country-day, weighted by the fraction of the country's event pixels under an active event; WERR_CD is the ratio of summed implied demand to summed generation, with uncertainty from a two-way (country × year) block bootstrap plus delta-method propagation of coefficient standard errors.</w:t>
+        <w:t>. The slope is a local marginal temperature sensitivity, estimated on deseasonalized residuals; out-of-sample R² is low or negative for many countries (§3.5), so we propagate coefficient uncertainty rather than claim predictive skill. Slope standard errors use a month-block bootstrap (B=500, months resampled with replacement within the training years). Instability is flagged when the slope changes sign across blocked-CV folds or |slope|/SE&lt;1; unstable slopes are shrunk via a normal–normal empirical-Bayes step toward the inverse-variance pooled mean (μ≈27 MW/°C, between-country τ²≈9.5×10³): posterior mean = (w·x + μ/τ²)/(w + 1/τ²) with w = 1/SE². The rule uses only training-period slope properties — never the WERR sign or magnitude — and affects GB (fixed at 0) plus DK, AT, NO, FI and CH. For each primary heatwave event we compute the association-implied temperature change ΔT = β_region·WFI, translate it to energy with the demand slope and event duration, and divide by the event's actual wind generation: WERR = ΔE_heat/E_wind. Uncertainty is bootstrapped over events, with Monte-Carlo draws of the atmospheric and demand coefficients inside each replicate (B=1000). Because pixel-level events share whole-country denominators (3,017 events reuse only ≈3.2k unique country-days, mean multiplicity 5.4), we also define a country-day estimand: each country's actual wind generation enters at most once per day, and the demand response is applied once per country-day, weighted by the fraction of the country's event pixels under an active event; WERR_CD is the ratio of summed implied demand to summed generation, with uncertainty from a two-way (country × year) block bootstrap plus delta-method propagation of coefficient standard errors. Formally the per-event ratio and the country-day estimand are:</w:t>
+      </w:r>
+    </w:p>
+    <w:p>
+      <m:oMathPara>
+        <m:oMathParaPr>
+          <m:jc m:val="center"/>
+        </m:oMathParaPr>
+        <m:oMath>
+          <m:sSub>
+            <m:e>
+              <m:r>
+                <m:rPr>
+                  <m:sty m:val="p"/>
+                </m:rPr>
+                <w:rPr>
+                  <w:rFonts w:ascii="Cambria Math" w:hAnsi="Cambria Math"/>
+                </w:rPr>
+                <m:t xml:space="preserve">WERR</m:t>
+              </m:r>
+            </m:e>
+            <m:sub>
+              <m:r>
+                <m:rPr/>
+                <w:rPr>
+                  <w:rFonts w:ascii="Cambria Math" w:hAnsi="Cambria Math"/>
+                </w:rPr>
+                <m:t xml:space="preserve">e</m:t>
+              </m:r>
+            </m:sub>
+          </m:sSub>
+          <m:r>
+            <m:rPr/>
+            <w:rPr>
+              <w:rFonts w:ascii="Cambria Math" w:hAnsi="Cambria Math"/>
+            </w:rPr>
+            <m:t xml:space="preserve"> = </m:t>
+          </m:r>
+          <m:f>
+            <m:num>
+              <m:r>
+                <m:rPr/>
+                <w:rPr>
+                  <w:rFonts w:ascii="Cambria Math" w:hAnsi="Cambria Math"/>
+                </w:rPr>
+                <m:t xml:space="preserve">Δ</m:t>
+              </m:r>
+              <m:sSub>
+                <m:e>
+                  <m:r>
+                    <m:rPr>
+                      <m:sty m:val="p"/>
+                    </m:rPr>
+                    <w:rPr>
+                      <w:rFonts w:ascii="Cambria Math" w:hAnsi="Cambria Math"/>
+                    </w:rPr>
+                    <m:t xml:space="preserve">E</m:t>
+                  </m:r>
+                </m:e>
+                <m:sub>
+                  <m:r>
+                    <m:rPr/>
+                    <w:rPr>
+                      <w:rFonts w:ascii="Cambria Math" w:hAnsi="Cambria Math"/>
+                    </w:rPr>
+                    <m:t xml:space="preserve">heat,e</m:t>
+                  </m:r>
+                </m:sub>
+              </m:sSub>
+            </m:num>
+            <m:den>
+              <m:sSub>
+                <m:e>
+                  <m:r>
+                    <m:rPr>
+                      <m:sty m:val="p"/>
+                    </m:rPr>
+                    <w:rPr>
+                      <w:rFonts w:ascii="Cambria Math" w:hAnsi="Cambria Math"/>
+                    </w:rPr>
+                    <m:t xml:space="preserve">E</m:t>
+                  </m:r>
+                </m:e>
+                <m:sub>
+                  <m:r>
+                    <m:rPr/>
+                    <w:rPr>
+                      <w:rFonts w:ascii="Cambria Math" w:hAnsi="Cambria Math"/>
+                    </w:rPr>
+                    <m:t xml:space="preserve">wind,e</m:t>
+                  </m:r>
+                </m:sub>
+              </m:sSub>
+            </m:den>
+          </m:f>
+        </m:oMath>
+      </m:oMathPara>
+    </w:p>
+    <w:p>
+      <m:oMathPara>
+        <m:oMathParaPr>
+          <m:jc m:val="center"/>
+        </m:oMathParaPr>
+        <m:oMath>
+          <m:sSub>
+            <m:e>
+              <m:r>
+                <m:rPr>
+                  <m:sty m:val="p"/>
+                </m:rPr>
+                <w:rPr>
+                  <w:rFonts w:ascii="Cambria Math" w:hAnsi="Cambria Math"/>
+                </w:rPr>
+                <m:t xml:space="preserve">WERR</m:t>
+              </m:r>
+            </m:e>
+            <m:sub>
+              <m:r>
+                <m:rPr/>
+                <w:rPr>
+                  <w:rFonts w:ascii="Cambria Math" w:hAnsi="Cambria Math"/>
+                </w:rPr>
+                <m:t xml:space="preserve">CD</m:t>
+              </m:r>
+            </m:sub>
+          </m:sSub>
+          <m:r>
+            <m:rPr/>
+            <w:rPr>
+              <w:rFonts w:ascii="Cambria Math" w:hAnsi="Cambria Math"/>
+            </w:rPr>
+            <m:t xml:space="preserve"> = </m:t>
+          </m:r>
+          <m:f>
+            <m:num>
+              <m:nary>
+                <m:naryPr>
+                  <m:chr m:val="∑"/>
+                  <m:limLoc m:val="undOvr"/>
+                  <m:subHide m:val="0"/>
+                  <m:supHide m:val="1"/>
+                </m:naryPr>
+                <m:sub>
+                  <m:r>
+                    <m:rPr/>
+                    <w:rPr>
+                      <w:rFonts w:ascii="Cambria Math" w:hAnsi="Cambria Math"/>
+                    </w:rPr>
+                    <m:t xml:space="preserve">d∈D_c</m:t>
+                  </m:r>
+                </m:sub>
+                <m:sup/>
+                <m:e>
+                  <m:r>
+                    <m:rPr/>
+                    <w:rPr>
+                      <w:rFonts w:ascii="Cambria Math" w:hAnsi="Cambria Math"/>
+                    </w:rPr>
+                    <m:t xml:space="preserve">Δ</m:t>
+                  </m:r>
+                  <m:sSub>
+                    <m:e>
+                      <m:r>
+                        <m:rPr>
+                          <m:sty m:val="p"/>
+                        </m:rPr>
+                        <w:rPr>
+                          <w:rFonts w:ascii="Cambria Math" w:hAnsi="Cambria Math"/>
+                        </w:rPr>
+                        <m:t xml:space="preserve">E</m:t>
+                      </m:r>
+                    </m:e>
+                    <m:sub>
+                      <m:r>
+                        <m:rPr/>
+                        <w:rPr>
+                          <w:rFonts w:ascii="Cambria Math" w:hAnsi="Cambria Math"/>
+                        </w:rPr>
+                        <m:t xml:space="preserve">heat,d</m:t>
+                      </m:r>
+                    </m:sub>
+                  </m:sSub>
+                </m:e>
+              </m:nary>
+            </m:num>
+            <m:den>
+              <m:nary>
+                <m:naryPr>
+                  <m:chr m:val="∑"/>
+                  <m:limLoc m:val="undOvr"/>
+                  <m:subHide m:val="0"/>
+                  <m:supHide m:val="1"/>
+                </m:naryPr>
+                <m:sub>
+                  <m:r>
+                    <m:rPr/>
+                    <w:rPr>
+                      <w:rFonts w:ascii="Cambria Math" w:hAnsi="Cambria Math"/>
+                    </w:rPr>
+                    <m:t xml:space="preserve">d∈D_c</m:t>
+                  </m:r>
+                </m:sub>
+                <m:sup/>
+                <m:e>
+                  <m:sSub>
+                    <m:e>
+                      <m:r>
+                        <m:rPr>
+                          <m:sty m:val="p"/>
+                        </m:rPr>
+                        <w:rPr>
+                          <w:rFonts w:ascii="Cambria Math" w:hAnsi="Cambria Math"/>
+                        </w:rPr>
+                        <m:t xml:space="preserve">E</m:t>
+                      </m:r>
+                    </m:e>
+                    <m:sub>
+                      <m:r>
+                        <m:rPr/>
+                        <w:rPr>
+                          <w:rFonts w:ascii="Cambria Math" w:hAnsi="Cambria Math"/>
+                        </w:rPr>
+                        <m:t xml:space="preserve">wind,d</m:t>
+                      </m:r>
+                    </m:sub>
+                  </m:sSub>
+                </m:e>
+              </m:nary>
+            </m:den>
+          </m:f>
+        </m:oMath>
+      </m:oMathPara>
+    </w:p>
+    <w:p>
+      <w:r>
+        <w:t>with ΔE_heat,d = ŝ_c · β̂_r · WFI_r(d) · 24h · φ_d (demand slope ŝ, regional exposure coefficient β̂, 24-hour duration and pixel coverage φ), D_c the eligible country-day set and E_wind the country's actual daily wind generation. The event mean averages the per-event WERR_e, while the country-day estimand is a ratio of sums so a whole-country denominator can no longer be shared by many simultaneous pixel-events.</w:t>
       </w:r>
     </w:p>
     <w:p>
@@ -3295,7 +3757,7 @@
           <w:i/>
           <w:sz w:val="18"/>
         </w:rPr>
-        <w:t>Figure 1. (a) Harmonized turbine register (140k units; colour = rated MW) with the five moisture transects (lines) and downstream regional boxes (dashed).</w:t>
+        <w:t>Fig. 1. (a) Harmonized turbine register (140k units; colour = rated MW) with the five moisture transects (lines) and downstream regional boxes (dashed).</w:t>
       </w:r>
     </w:p>
     <w:p>
@@ -3343,7 +3805,7 @@
           <w:i/>
           <w:sz w:val="18"/>
         </w:rPr>
-        <w:t>Figure 2. (a) MJJAS mean moisture-flux convergence (kg m⁻² d⁻¹); (b) 30-day-smoothed cross-transect fluxes.</w:t>
+        <w:t>Fig. 2. (a) MJJAS mean moisture-flux convergence (kg m⁻² d⁻¹); (b) 30-day-smoothed cross-transect fluxes.</w:t>
       </w:r>
     </w:p>
     <w:p>
@@ -3391,7 +3853,7 @@
           <w:i/>
           <w:sz w:val="18"/>
         </w:rPr>
-        <w:t>Figure 3. Heatwave climatology 2000–2021 under the primary definition (Tmax &gt; DOY-pct95, ≥3 d).</w:t>
+        <w:t>Fig. 3. Heatwave climatology 2000–2021 under the primary definition (Tmax &gt; DOY-pct95, ≥3 d).</w:t>
       </w:r>
     </w:p>
     <w:p>
@@ -3439,7 +3901,7 @@
           <w:i/>
           <w:sz w:val="18"/>
         </w:rPr>
-        <w:t>Figure 4. Regional panel coefficient of Tmax anomaly on upstream WFI (95% bootstrap CI).</w:t>
+        <w:t>Fig. 4. Regional panel coefficient of Tmax anomaly on upstream WFI (95% bootstrap CI).</w:t>
       </w:r>
     </w:p>
     <w:p>
@@ -3487,7 +3949,7 @@
           <w:i/>
           <w:sz w:val="18"/>
         </w:rPr>
-        <w:t>Figure 5. Circulation-matched high- vs low-WFI Tmax differences (95% bootstrap CI).</w:t>
+        <w:t>Fig. 5. Circulation-matched high- vs low-WFI Tmax differences (95% bootstrap CI).</w:t>
       </w:r>
     </w:p>
     <w:p>
@@ -3535,7 +3997,7 @@
           <w:i/>
           <w:sz w:val="18"/>
         </w:rPr>
-        <w:t>Figure 6. Event-study coefficients around first treatment year (treated minus never-treated).</w:t>
+        <w:t>Fig. 6. Event-study coefficients around first treatment year (treated minus never-treated).</w:t>
       </w:r>
     </w:p>
     <w:p>
@@ -3583,7 +4045,7 @@
           <w:i/>
           <w:sz w:val="18"/>
         </w:rPr>
-        <w:t>Figure 7. Falsification-and-sensitivity battery coefficients (red: p&lt;0.05).</w:t>
+        <w:t>Fig. 7. Falsification-and-sensitivity battery coefficients (red: p&lt;0.05).</w:t>
       </w:r>
     </w:p>
     <w:p>
@@ -3631,7 +4093,7 @@
           <w:i/>
           <w:sz w:val="18"/>
         </w:rPr>
-        <w:t>Figure 8. Signed WERR per country with 95% bootstrap CI; dashed = pooled event-mean estimate. The country-day ratio-of-sums estimand WERR_CD is reported in Table 4 and §3.7.</w:t>
+        <w:t>Fig. 8. Signed WERR per country with 95% bootstrap CI; dashed = pooled event-mean estimate. The country-day ratio-of-sums estimand WERR_CD is reported in Table 4 and §3.7.</w:t>
       </w:r>
     </w:p>
     <w:p>

</xml_diff>